<commit_message>
Match full-exam layout to JPG: inline tianzige blanks and U2 选字表.
Pinyin writing boxes sit in-sentence like the scans; choice-char block uses a left bank.

Co-authored-by: Cursor <cursoragent@cursor.com>
</commit_message>
<xml_diff>
--- a/printables/full/u01-full.docx
+++ b/printables/full/u01-full.docx
@@ -4,7 +4,7 @@
   <w:body>
     <w:p>
       <w:pPr>
-        <w:spacing w:before="0" w:after="80" w:line="276" w:lineRule="auto"/>
+        <w:spacing w:before="0" w:after="120" w:line="276" w:lineRule="auto"/>
         <w:jc w:val="center"/>
       </w:pPr>
       <w:r>
@@ -12,28 +12,28 @@
           <w:rFonts w:ascii="黑体" w:hAnsi="黑体" w:eastAsia="黑体"/>
           <w:b/>
           <w:color w:val="1C1917"/>
-          <w:sz w:val="30"/>
+          <w:sz w:val="32"/>
         </w:rPr>
         <w:t>语文·四上·第一单元练习</w:t>
       </w:r>
     </w:p>
     <w:p>
       <w:pPr>
-        <w:spacing w:before="0" w:after="120" w:line="276" w:lineRule="auto"/>
+        <w:spacing w:before="0" w:after="160" w:line="276" w:lineRule="auto"/>
       </w:pPr>
       <w:r>
         <w:rPr>
           <w:rFonts w:ascii="宋体" w:hAnsi="宋体" w:eastAsia="宋体"/>
           <w:b w:val="0"/>
           <w:color w:val="1C1917"/>
-          <w:sz w:val="20"/>
+          <w:sz w:val="21"/>
         </w:rPr>
         <w:t>学校：____________　班级：________　姓名：____________　成绩：________</w:t>
       </w:r>
     </w:p>
     <w:p>
       <w:pPr>
-        <w:spacing w:before="140" w:after="80" w:line="276" w:lineRule="auto"/>
+        <w:spacing w:before="160" w:after="80" w:line="276" w:lineRule="auto"/>
       </w:pPr>
       <w:r>
         <w:rPr>
@@ -45,62 +45,40 @@
         <w:t>一、看拼音，写词语。</w:t>
       </w:r>
     </w:p>
-    <w:p>
-      <w:pPr>
-        <w:spacing w:before="0" w:after="20" w:line="276" w:lineRule="auto"/>
-      </w:pPr>
-      <w:r>
-        <w:rPr>
-          <w:rFonts w:ascii="宋体" w:hAnsi="宋体" w:eastAsia="宋体"/>
-          <w:b w:val="0"/>
-          <w:color w:val="1C1917"/>
-          <w:sz w:val="21"/>
-        </w:rPr>
-        <w:t>深蓝色的天空中，悬着</w:t>
-      </w:r>
-    </w:p>
-    <w:p>
-      <w:pPr>
-        <w:spacing w:before="20" w:after="20" w:line="240" w:lineRule="auto"/>
-      </w:pPr>
-      <w:r>
-        <w:rPr>
-          <w:rFonts w:ascii="Times New Roman" w:hAnsi="Times New Roman" w:eastAsia="宋体"/>
-          <w:b w:val="0"/>
-          <w:color w:val="1C1917"/>
-          <w:sz w:val="20"/>
-        </w:rPr>
-        <w:t>fán xīng</w:t>
-      </w:r>
-    </w:p>
     <w:tbl>
       <w:tblPr>
         <w:tblW w:type="auto" w:w="0"/>
         <w:jc w:val="left"/>
-        <w:tblLayout w:type="fixed"/>
+        <w:tblLayout w:type="autofit"/>
         <w:tblLook w:firstColumn="1" w:firstRow="1" w:lastColumn="0" w:lastRow="0" w:noHBand="0" w:noVBand="1" w:val="04A0"/>
+        <w:tblBorders>
+          <w:top w:val="nil"/>
+          <w:left w:val="nil"/>
+          <w:bottom w:val="nil"/>
+          <w:right w:val="nil"/>
+          <w:insideH w:val="nil"/>
+          <w:insideV w:val="nil"/>
+        </w:tblBorders>
       </w:tblPr>
       <w:tblGrid>
-        <w:gridCol w:w="5103"/>
-        <w:gridCol w:w="5103"/>
+        <w:gridCol w:w="3326"/>
+        <w:gridCol w:w="3326"/>
+        <w:gridCol w:w="3326"/>
       </w:tblGrid>
       <w:tr>
         <w:trPr>
-          <w:trHeight w:val="464" w:hRule="atLeast"/>
+          <w:trHeight w:val="612" w:hRule="atLeast"/>
         </w:trPr>
         <w:tc>
           <w:tcPr>
-            <w:tcW w:type="dxa" w:w="465"/>
-            <w:tcBorders>
-              <w:top w:val="single" w:sz="12" w:space="0" w:color="000000"/>
-              <w:left w:val="single" w:sz="12" w:space="0" w:color="000000"/>
-              <w:bottom w:val="single" w:sz="12" w:space="0" w:color="000000"/>
-              <w:right w:val="single" w:sz="12" w:space="0" w:color="000000"/>
-            </w:tcBorders>
+            <w:tcW w:type="dxa" w:w="3118"/>
+            <w:vAlign w:val="center"/>
+            <w:tcBorders/>
           </w:tcPr>
           <w:p>
             <w:pPr>
               <w:spacing w:before="0" w:after="0"/>
+              <w:jc w:val="left"/>
             </w:pPr>
             <w:r/>
             <w:r>
@@ -108,25 +86,338 @@
                 <w:rFonts w:ascii="宋体" w:hAnsi="宋体" w:eastAsia="宋体"/>
                 <w:b w:val="0"/>
                 <w:color w:val="1C1917"/>
-                <w:sz w:val="28"/>
+                <w:sz w:val="21"/>
               </w:rPr>
-              <w:t xml:space="preserve">　</w:t>
+              <w:t>深蓝色的天空中，悬着</w:t>
             </w:r>
           </w:p>
         </w:tc>
         <w:tc>
           <w:tcPr>
-            <w:tcW w:type="dxa" w:w="465"/>
-            <w:tcBorders>
-              <w:top w:val="single" w:sz="12" w:space="0" w:color="000000"/>
-              <w:left w:val="single" w:sz="12" w:space="0" w:color="000000"/>
-              <w:bottom w:val="single" w:sz="12" w:space="0" w:color="000000"/>
-              <w:right w:val="single" w:sz="12" w:space="0" w:color="000000"/>
-            </w:tcBorders>
+            <w:tcW w:type="dxa" w:w="907"/>
+            <w:vAlign w:val="center"/>
+            <w:tcBorders/>
           </w:tcPr>
           <w:p>
             <w:pPr>
               <w:spacing w:before="0" w:after="0"/>
+              <w:jc w:val="center"/>
+            </w:pPr>
+            <w:r/>
+            <w:r>
+              <w:rPr>
+                <w:rFonts w:ascii="Times New Roman" w:hAnsi="Times New Roman" w:eastAsia="宋体"/>
+                <w:b w:val="0"/>
+                <w:color w:val="1C1917"/>
+                <w:sz w:val="17"/>
+              </w:rPr>
+              <w:t>fán xīng</w:t>
+            </w:r>
+          </w:p>
+          <w:tbl>
+            <w:tblPr>
+              <w:tblW w:type="auto" w:w="0"/>
+              <w:tblLayout w:type="fixed"/>
+              <w:tblLook w:firstColumn="1" w:firstRow="1" w:lastColumn="0" w:lastRow="0" w:noHBand="0" w:noVBand="1" w:val="04A0"/>
+            </w:tblPr>
+            <w:tblGrid>
+              <w:gridCol w:w="453"/>
+              <w:gridCol w:w="453"/>
+            </w:tblGrid>
+            <w:tr>
+              <w:trPr>
+                <w:trHeight w:val="396" w:hRule="exact"/>
+              </w:trPr>
+              <w:tc>
+                <w:tcPr>
+                  <w:tcW w:type="dxa" w:w="397"/>
+                  <w:tcBorders/>
+                </w:tcPr>
+                <w:p>
+                  <w:pPr>
+                    <w:spacing w:before="0" w:after="0"/>
+                  </w:pPr>
+                  <w:r/>
+                </w:p>
+                <w:tbl>
+                  <w:tblPr>
+                    <w:tblW w:type="auto" w:w="0"/>
+                    <w:tblLayout w:type="fixed"/>
+                    <w:tblLook w:firstColumn="1" w:firstRow="1" w:lastColumn="0" w:lastRow="0" w:noHBand="0" w:noVBand="1" w:val="04A0"/>
+                  </w:tblPr>
+                  <w:tblGrid>
+                    <w:gridCol w:w="198"/>
+                    <w:gridCol w:w="198"/>
+                  </w:tblGrid>
+                  <w:tr>
+                    <w:trPr>
+                      <w:trHeight w:val="198" w:hRule="exact"/>
+                    </w:trPr>
+                    <w:tc>
+                      <w:tcPr>
+                        <w:tcW w:type="dxa" w:w="198"/>
+                        <w:tcBorders>
+                          <w:top w:val="single" w:sz="12" w:space="0" w:color="000000"/>
+                          <w:left w:val="single" w:sz="12" w:space="0" w:color="000000"/>
+                          <w:bottom w:val="dashed" w:sz="6" w:space="0" w:color="808080"/>
+                          <w:right w:val="dashed" w:sz="6" w:space="0" w:color="808080"/>
+                        </w:tcBorders>
+                      </w:tcPr>
+                      <w:p>
+                        <w:pPr>
+                          <w:spacing w:before="0" w:after="0"/>
+                        </w:pPr>
+                        <w:r/>
+                        <w:r>
+                          <w:rPr>
+                            <w:rFonts w:ascii="宋体" w:hAnsi="宋体" w:eastAsia="宋体"/>
+                            <w:b w:val="0"/>
+                            <w:color w:val="1C1917"/>
+                            <w:sz w:val="12"/>
+                          </w:rPr>
+                          <w:t xml:space="preserve"> </w:t>
+                        </w:r>
+                      </w:p>
+                    </w:tc>
+                    <w:tc>
+                      <w:tcPr>
+                        <w:tcW w:type="dxa" w:w="198"/>
+                        <w:tcBorders>
+                          <w:top w:val="single" w:sz="12" w:space="0" w:color="000000"/>
+                          <w:left w:val="dashed" w:sz="6" w:space="0" w:color="808080"/>
+                          <w:bottom w:val="dashed" w:sz="6" w:space="0" w:color="808080"/>
+                          <w:right w:val="single" w:sz="12" w:space="0" w:color="000000"/>
+                        </w:tcBorders>
+                      </w:tcPr>
+                      <w:p>
+                        <w:pPr>
+                          <w:spacing w:before="0" w:after="0"/>
+                        </w:pPr>
+                        <w:r/>
+                        <w:r>
+                          <w:rPr>
+                            <w:rFonts w:ascii="宋体" w:hAnsi="宋体" w:eastAsia="宋体"/>
+                            <w:b w:val="0"/>
+                            <w:color w:val="1C1917"/>
+                            <w:sz w:val="12"/>
+                          </w:rPr>
+                          <w:t xml:space="preserve"> </w:t>
+                        </w:r>
+                      </w:p>
+                    </w:tc>
+                  </w:tr>
+                  <w:tr>
+                    <w:trPr>
+                      <w:trHeight w:val="198" w:hRule="exact"/>
+                    </w:trPr>
+                    <w:tc>
+                      <w:tcPr>
+                        <w:tcW w:type="dxa" w:w="198"/>
+                        <w:tcBorders>
+                          <w:top w:val="dashed" w:sz="6" w:space="0" w:color="808080"/>
+                          <w:left w:val="single" w:sz="12" w:space="0" w:color="000000"/>
+                          <w:bottom w:val="single" w:sz="12" w:space="0" w:color="000000"/>
+                          <w:right w:val="dashed" w:sz="6" w:space="0" w:color="808080"/>
+                        </w:tcBorders>
+                      </w:tcPr>
+                      <w:p>
+                        <w:pPr>
+                          <w:spacing w:before="0" w:after="0"/>
+                        </w:pPr>
+                        <w:r/>
+                        <w:r>
+                          <w:rPr>
+                            <w:rFonts w:ascii="宋体" w:hAnsi="宋体" w:eastAsia="宋体"/>
+                            <w:b w:val="0"/>
+                            <w:color w:val="1C1917"/>
+                            <w:sz w:val="12"/>
+                          </w:rPr>
+                          <w:t xml:space="preserve"> </w:t>
+                        </w:r>
+                      </w:p>
+                    </w:tc>
+                    <w:tc>
+                      <w:tcPr>
+                        <w:tcW w:type="dxa" w:w="198"/>
+                        <w:tcBorders>
+                          <w:top w:val="dashed" w:sz="6" w:space="0" w:color="808080"/>
+                          <w:left w:val="dashed" w:sz="6" w:space="0" w:color="808080"/>
+                          <w:bottom w:val="single" w:sz="12" w:space="0" w:color="000000"/>
+                          <w:right w:val="single" w:sz="12" w:space="0" w:color="000000"/>
+                        </w:tcBorders>
+                      </w:tcPr>
+                      <w:p>
+                        <w:pPr>
+                          <w:spacing w:before="0" w:after="0"/>
+                        </w:pPr>
+                        <w:r/>
+                        <w:r>
+                          <w:rPr>
+                            <w:rFonts w:ascii="宋体" w:hAnsi="宋体" w:eastAsia="宋体"/>
+                            <w:b w:val="0"/>
+                            <w:color w:val="1C1917"/>
+                            <w:sz w:val="12"/>
+                          </w:rPr>
+                          <w:t xml:space="preserve"> </w:t>
+                        </w:r>
+                      </w:p>
+                    </w:tc>
+                  </w:tr>
+                </w:tbl>
+                <w:p/>
+              </w:tc>
+              <w:tc>
+                <w:tcPr>
+                  <w:tcW w:type="dxa" w:w="397"/>
+                  <w:tcBorders/>
+                </w:tcPr>
+                <w:p>
+                  <w:pPr>
+                    <w:spacing w:before="0" w:after="0"/>
+                  </w:pPr>
+                  <w:r/>
+                </w:p>
+                <w:tbl>
+                  <w:tblPr>
+                    <w:tblW w:type="auto" w:w="0"/>
+                    <w:tblLayout w:type="fixed"/>
+                    <w:tblLook w:firstColumn="1" w:firstRow="1" w:lastColumn="0" w:lastRow="0" w:noHBand="0" w:noVBand="1" w:val="04A0"/>
+                  </w:tblPr>
+                  <w:tblGrid>
+                    <w:gridCol w:w="198"/>
+                    <w:gridCol w:w="198"/>
+                  </w:tblGrid>
+                  <w:tr>
+                    <w:trPr>
+                      <w:trHeight w:val="198" w:hRule="exact"/>
+                    </w:trPr>
+                    <w:tc>
+                      <w:tcPr>
+                        <w:tcW w:type="dxa" w:w="198"/>
+                        <w:tcBorders>
+                          <w:top w:val="single" w:sz="12" w:space="0" w:color="000000"/>
+                          <w:left w:val="single" w:sz="12" w:space="0" w:color="000000"/>
+                          <w:bottom w:val="dashed" w:sz="6" w:space="0" w:color="808080"/>
+                          <w:right w:val="dashed" w:sz="6" w:space="0" w:color="808080"/>
+                        </w:tcBorders>
+                      </w:tcPr>
+                      <w:p>
+                        <w:pPr>
+                          <w:spacing w:before="0" w:after="0"/>
+                        </w:pPr>
+                        <w:r/>
+                        <w:r>
+                          <w:rPr>
+                            <w:rFonts w:ascii="宋体" w:hAnsi="宋体" w:eastAsia="宋体"/>
+                            <w:b w:val="0"/>
+                            <w:color w:val="1C1917"/>
+                            <w:sz w:val="12"/>
+                          </w:rPr>
+                          <w:t xml:space="preserve"> </w:t>
+                        </w:r>
+                      </w:p>
+                    </w:tc>
+                    <w:tc>
+                      <w:tcPr>
+                        <w:tcW w:type="dxa" w:w="198"/>
+                        <w:tcBorders>
+                          <w:top w:val="single" w:sz="12" w:space="0" w:color="000000"/>
+                          <w:left w:val="dashed" w:sz="6" w:space="0" w:color="808080"/>
+                          <w:bottom w:val="dashed" w:sz="6" w:space="0" w:color="808080"/>
+                          <w:right w:val="single" w:sz="12" w:space="0" w:color="000000"/>
+                        </w:tcBorders>
+                      </w:tcPr>
+                      <w:p>
+                        <w:pPr>
+                          <w:spacing w:before="0" w:after="0"/>
+                        </w:pPr>
+                        <w:r/>
+                        <w:r>
+                          <w:rPr>
+                            <w:rFonts w:ascii="宋体" w:hAnsi="宋体" w:eastAsia="宋体"/>
+                            <w:b w:val="0"/>
+                            <w:color w:val="1C1917"/>
+                            <w:sz w:val="12"/>
+                          </w:rPr>
+                          <w:t xml:space="preserve"> </w:t>
+                        </w:r>
+                      </w:p>
+                    </w:tc>
+                  </w:tr>
+                  <w:tr>
+                    <w:trPr>
+                      <w:trHeight w:val="198" w:hRule="exact"/>
+                    </w:trPr>
+                    <w:tc>
+                      <w:tcPr>
+                        <w:tcW w:type="dxa" w:w="198"/>
+                        <w:tcBorders>
+                          <w:top w:val="dashed" w:sz="6" w:space="0" w:color="808080"/>
+                          <w:left w:val="single" w:sz="12" w:space="0" w:color="000000"/>
+                          <w:bottom w:val="single" w:sz="12" w:space="0" w:color="000000"/>
+                          <w:right w:val="dashed" w:sz="6" w:space="0" w:color="808080"/>
+                        </w:tcBorders>
+                      </w:tcPr>
+                      <w:p>
+                        <w:pPr>
+                          <w:spacing w:before="0" w:after="0"/>
+                        </w:pPr>
+                        <w:r/>
+                        <w:r>
+                          <w:rPr>
+                            <w:rFonts w:ascii="宋体" w:hAnsi="宋体" w:eastAsia="宋体"/>
+                            <w:b w:val="0"/>
+                            <w:color w:val="1C1917"/>
+                            <w:sz w:val="12"/>
+                          </w:rPr>
+                          <w:t xml:space="preserve"> </w:t>
+                        </w:r>
+                      </w:p>
+                    </w:tc>
+                    <w:tc>
+                      <w:tcPr>
+                        <w:tcW w:type="dxa" w:w="198"/>
+                        <w:tcBorders>
+                          <w:top w:val="dashed" w:sz="6" w:space="0" w:color="808080"/>
+                          <w:left w:val="dashed" w:sz="6" w:space="0" w:color="808080"/>
+                          <w:bottom w:val="single" w:sz="12" w:space="0" w:color="000000"/>
+                          <w:right w:val="single" w:sz="12" w:space="0" w:color="000000"/>
+                        </w:tcBorders>
+                      </w:tcPr>
+                      <w:p>
+                        <w:pPr>
+                          <w:spacing w:before="0" w:after="0"/>
+                        </w:pPr>
+                        <w:r/>
+                        <w:r>
+                          <w:rPr>
+                            <w:rFonts w:ascii="宋体" w:hAnsi="宋体" w:eastAsia="宋体"/>
+                            <w:b w:val="0"/>
+                            <w:color w:val="1C1917"/>
+                            <w:sz w:val="12"/>
+                          </w:rPr>
+                          <w:t xml:space="preserve"> </w:t>
+                        </w:r>
+                      </w:p>
+                    </w:tc>
+                  </w:tr>
+                </w:tbl>
+                <w:p/>
+              </w:tc>
+            </w:tr>
+          </w:tbl>
+          <w:p/>
+        </w:tc>
+        <w:tc>
+          <w:tcPr>
+            <w:tcW w:type="dxa" w:w="4592"/>
+            <w:vAlign w:val="center"/>
+            <w:tcBorders/>
+          </w:tcPr>
+          <w:p>
+            <w:pPr>
+              <w:spacing w:before="0" w:after="0"/>
+              <w:jc w:val="left"/>
             </w:pPr>
             <w:r/>
             <w:r>
@@ -134,9 +425,9 @@
                 <w:rFonts w:ascii="宋体" w:hAnsi="宋体" w:eastAsia="宋体"/>
                 <w:b w:val="0"/>
                 <w:color w:val="1C1917"/>
-                <w:sz w:val="28"/>
+                <w:sz w:val="21"/>
               </w:rPr>
-              <w:t xml:space="preserve">　</w:t>
+              <w:t>。它们是这样低，真是摇摇欲坠。</w:t>
             </w:r>
           </w:p>
         </w:tc>
@@ -144,79 +435,45 @@
     </w:tbl>
     <w:p>
       <w:pPr>
-        <w:spacing w:before="0" w:after="60"/>
+        <w:spacing w:before="0" w:after="40"/>
       </w:pPr>
-    </w:p>
-    <w:p>
-      <w:pPr>
-        <w:spacing w:before="0" w:after="80" w:line="276" w:lineRule="auto"/>
-      </w:pPr>
-      <w:r>
-        <w:rPr>
-          <w:rFonts w:ascii="宋体" w:hAnsi="宋体" w:eastAsia="宋体"/>
-          <w:b w:val="0"/>
-          <w:color w:val="1C1917"/>
-          <w:sz w:val="21"/>
-        </w:rPr>
-        <w:t>。它们是这样低，真是摇摇欲坠。</w:t>
-      </w:r>
-    </w:p>
-    <w:p>
-      <w:pPr>
-        <w:spacing w:before="0" w:after="20" w:line="276" w:lineRule="auto"/>
-      </w:pPr>
-      <w:r>
-        <w:rPr>
-          <w:rFonts w:ascii="宋体" w:hAnsi="宋体" w:eastAsia="宋体"/>
-          <w:b w:val="0"/>
-          <w:color w:val="1C1917"/>
-          <w:sz w:val="21"/>
-        </w:rPr>
-        <w:t>渐渐地我的眼睛</w:t>
-      </w:r>
-    </w:p>
-    <w:p>
-      <w:pPr>
-        <w:spacing w:before="20" w:after="20" w:line="240" w:lineRule="auto"/>
-      </w:pPr>
-      <w:r>
-        <w:rPr>
-          <w:rFonts w:ascii="Times New Roman" w:hAnsi="Times New Roman" w:eastAsia="宋体"/>
-          <w:b w:val="0"/>
-          <w:color w:val="1C1917"/>
-          <w:sz w:val="20"/>
-        </w:rPr>
-        <w:t>mó hu</w:t>
-      </w:r>
     </w:p>
     <w:tbl>
       <w:tblPr>
         <w:tblW w:type="auto" w:w="0"/>
         <w:jc w:val="left"/>
-        <w:tblLayout w:type="fixed"/>
+        <w:tblLayout w:type="autofit"/>
         <w:tblLook w:firstColumn="1" w:firstRow="1" w:lastColumn="0" w:lastRow="0" w:noHBand="0" w:noVBand="1" w:val="04A0"/>
+        <w:tblBorders>
+          <w:top w:val="nil"/>
+          <w:left w:val="nil"/>
+          <w:bottom w:val="nil"/>
+          <w:right w:val="nil"/>
+          <w:insideH w:val="nil"/>
+          <w:insideV w:val="nil"/>
+        </w:tblBorders>
       </w:tblPr>
       <w:tblGrid>
-        <w:gridCol w:w="5103"/>
-        <w:gridCol w:w="5103"/>
+        <w:gridCol w:w="1996"/>
+        <w:gridCol w:w="1996"/>
+        <w:gridCol w:w="1996"/>
+        <w:gridCol w:w="1996"/>
+        <w:gridCol w:w="1996"/>
       </w:tblGrid>
       <w:tr>
         <w:trPr>
-          <w:trHeight w:val="464" w:hRule="atLeast"/>
+          <w:trHeight w:val="612" w:hRule="atLeast"/>
         </w:trPr>
         <w:tc>
           <w:tcPr>
-            <w:tcW w:type="dxa" w:w="465"/>
-            <w:tcBorders>
-              <w:top w:val="single" w:sz="12" w:space="0" w:color="000000"/>
-              <w:left w:val="single" w:sz="12" w:space="0" w:color="000000"/>
-              <w:bottom w:val="single" w:sz="12" w:space="0" w:color="000000"/>
-              <w:right w:val="single" w:sz="12" w:space="0" w:color="000000"/>
-            </w:tcBorders>
+            <w:tcW w:type="dxa" w:w="2234"/>
+            <w:vAlign w:val="center"/>
+            <w:tcBorders/>
           </w:tcPr>
           <w:p>
             <w:pPr>
               <w:spacing w:before="0" w:after="0"/>
+              <w:jc w:val="left"/>
             </w:pPr>
             <w:r/>
             <w:r>
@@ -224,25 +481,338 @@
                 <w:rFonts w:ascii="宋体" w:hAnsi="宋体" w:eastAsia="宋体"/>
                 <w:b w:val="0"/>
                 <w:color w:val="1C1917"/>
-                <w:sz w:val="28"/>
+                <w:sz w:val="21"/>
               </w:rPr>
-              <w:t xml:space="preserve">　</w:t>
+              <w:t>渐渐地我的眼睛</w:t>
             </w:r>
           </w:p>
         </w:tc>
         <w:tc>
           <w:tcPr>
-            <w:tcW w:type="dxa" w:w="465"/>
-            <w:tcBorders>
-              <w:top w:val="single" w:sz="12" w:space="0" w:color="000000"/>
-              <w:left w:val="single" w:sz="12" w:space="0" w:color="000000"/>
-              <w:bottom w:val="single" w:sz="12" w:space="0" w:color="000000"/>
-              <w:right w:val="single" w:sz="12" w:space="0" w:color="000000"/>
-            </w:tcBorders>
+            <w:tcW w:type="dxa" w:w="907"/>
+            <w:vAlign w:val="center"/>
+            <w:tcBorders/>
           </w:tcPr>
           <w:p>
             <w:pPr>
               <w:spacing w:before="0" w:after="0"/>
+              <w:jc w:val="center"/>
+            </w:pPr>
+            <w:r/>
+            <w:r>
+              <w:rPr>
+                <w:rFonts w:ascii="Times New Roman" w:hAnsi="Times New Roman" w:eastAsia="宋体"/>
+                <w:b w:val="0"/>
+                <w:color w:val="1C1917"/>
+                <w:sz w:val="17"/>
+              </w:rPr>
+              <w:t>mó hu</w:t>
+            </w:r>
+          </w:p>
+          <w:tbl>
+            <w:tblPr>
+              <w:tblW w:type="auto" w:w="0"/>
+              <w:tblLayout w:type="fixed"/>
+              <w:tblLook w:firstColumn="1" w:firstRow="1" w:lastColumn="0" w:lastRow="0" w:noHBand="0" w:noVBand="1" w:val="04A0"/>
+            </w:tblPr>
+            <w:tblGrid>
+              <w:gridCol w:w="453"/>
+              <w:gridCol w:w="453"/>
+            </w:tblGrid>
+            <w:tr>
+              <w:trPr>
+                <w:trHeight w:val="396" w:hRule="exact"/>
+              </w:trPr>
+              <w:tc>
+                <w:tcPr>
+                  <w:tcW w:type="dxa" w:w="397"/>
+                  <w:tcBorders/>
+                </w:tcPr>
+                <w:p>
+                  <w:pPr>
+                    <w:spacing w:before="0" w:after="0"/>
+                  </w:pPr>
+                  <w:r/>
+                </w:p>
+                <w:tbl>
+                  <w:tblPr>
+                    <w:tblW w:type="auto" w:w="0"/>
+                    <w:tblLayout w:type="fixed"/>
+                    <w:tblLook w:firstColumn="1" w:firstRow="1" w:lastColumn="0" w:lastRow="0" w:noHBand="0" w:noVBand="1" w:val="04A0"/>
+                  </w:tblPr>
+                  <w:tblGrid>
+                    <w:gridCol w:w="198"/>
+                    <w:gridCol w:w="198"/>
+                  </w:tblGrid>
+                  <w:tr>
+                    <w:trPr>
+                      <w:trHeight w:val="198" w:hRule="exact"/>
+                    </w:trPr>
+                    <w:tc>
+                      <w:tcPr>
+                        <w:tcW w:type="dxa" w:w="198"/>
+                        <w:tcBorders>
+                          <w:top w:val="single" w:sz="12" w:space="0" w:color="000000"/>
+                          <w:left w:val="single" w:sz="12" w:space="0" w:color="000000"/>
+                          <w:bottom w:val="dashed" w:sz="6" w:space="0" w:color="808080"/>
+                          <w:right w:val="dashed" w:sz="6" w:space="0" w:color="808080"/>
+                        </w:tcBorders>
+                      </w:tcPr>
+                      <w:p>
+                        <w:pPr>
+                          <w:spacing w:before="0" w:after="0"/>
+                        </w:pPr>
+                        <w:r/>
+                        <w:r>
+                          <w:rPr>
+                            <w:rFonts w:ascii="宋体" w:hAnsi="宋体" w:eastAsia="宋体"/>
+                            <w:b w:val="0"/>
+                            <w:color w:val="1C1917"/>
+                            <w:sz w:val="12"/>
+                          </w:rPr>
+                          <w:t xml:space="preserve"> </w:t>
+                        </w:r>
+                      </w:p>
+                    </w:tc>
+                    <w:tc>
+                      <w:tcPr>
+                        <w:tcW w:type="dxa" w:w="198"/>
+                        <w:tcBorders>
+                          <w:top w:val="single" w:sz="12" w:space="0" w:color="000000"/>
+                          <w:left w:val="dashed" w:sz="6" w:space="0" w:color="808080"/>
+                          <w:bottom w:val="dashed" w:sz="6" w:space="0" w:color="808080"/>
+                          <w:right w:val="single" w:sz="12" w:space="0" w:color="000000"/>
+                        </w:tcBorders>
+                      </w:tcPr>
+                      <w:p>
+                        <w:pPr>
+                          <w:spacing w:before="0" w:after="0"/>
+                        </w:pPr>
+                        <w:r/>
+                        <w:r>
+                          <w:rPr>
+                            <w:rFonts w:ascii="宋体" w:hAnsi="宋体" w:eastAsia="宋体"/>
+                            <w:b w:val="0"/>
+                            <w:color w:val="1C1917"/>
+                            <w:sz w:val="12"/>
+                          </w:rPr>
+                          <w:t xml:space="preserve"> </w:t>
+                        </w:r>
+                      </w:p>
+                    </w:tc>
+                  </w:tr>
+                  <w:tr>
+                    <w:trPr>
+                      <w:trHeight w:val="198" w:hRule="exact"/>
+                    </w:trPr>
+                    <w:tc>
+                      <w:tcPr>
+                        <w:tcW w:type="dxa" w:w="198"/>
+                        <w:tcBorders>
+                          <w:top w:val="dashed" w:sz="6" w:space="0" w:color="808080"/>
+                          <w:left w:val="single" w:sz="12" w:space="0" w:color="000000"/>
+                          <w:bottom w:val="single" w:sz="12" w:space="0" w:color="000000"/>
+                          <w:right w:val="dashed" w:sz="6" w:space="0" w:color="808080"/>
+                        </w:tcBorders>
+                      </w:tcPr>
+                      <w:p>
+                        <w:pPr>
+                          <w:spacing w:before="0" w:after="0"/>
+                        </w:pPr>
+                        <w:r/>
+                        <w:r>
+                          <w:rPr>
+                            <w:rFonts w:ascii="宋体" w:hAnsi="宋体" w:eastAsia="宋体"/>
+                            <w:b w:val="0"/>
+                            <w:color w:val="1C1917"/>
+                            <w:sz w:val="12"/>
+                          </w:rPr>
+                          <w:t xml:space="preserve"> </w:t>
+                        </w:r>
+                      </w:p>
+                    </w:tc>
+                    <w:tc>
+                      <w:tcPr>
+                        <w:tcW w:type="dxa" w:w="198"/>
+                        <w:tcBorders>
+                          <w:top w:val="dashed" w:sz="6" w:space="0" w:color="808080"/>
+                          <w:left w:val="dashed" w:sz="6" w:space="0" w:color="808080"/>
+                          <w:bottom w:val="single" w:sz="12" w:space="0" w:color="000000"/>
+                          <w:right w:val="single" w:sz="12" w:space="0" w:color="000000"/>
+                        </w:tcBorders>
+                      </w:tcPr>
+                      <w:p>
+                        <w:pPr>
+                          <w:spacing w:before="0" w:after="0"/>
+                        </w:pPr>
+                        <w:r/>
+                        <w:r>
+                          <w:rPr>
+                            <w:rFonts w:ascii="宋体" w:hAnsi="宋体" w:eastAsia="宋体"/>
+                            <w:b w:val="0"/>
+                            <w:color w:val="1C1917"/>
+                            <w:sz w:val="12"/>
+                          </w:rPr>
+                          <w:t xml:space="preserve"> </w:t>
+                        </w:r>
+                      </w:p>
+                    </w:tc>
+                  </w:tr>
+                </w:tbl>
+                <w:p/>
+              </w:tc>
+              <w:tc>
+                <w:tcPr>
+                  <w:tcW w:type="dxa" w:w="397"/>
+                  <w:tcBorders/>
+                </w:tcPr>
+                <w:p>
+                  <w:pPr>
+                    <w:spacing w:before="0" w:after="0"/>
+                  </w:pPr>
+                  <w:r/>
+                </w:p>
+                <w:tbl>
+                  <w:tblPr>
+                    <w:tblW w:type="auto" w:w="0"/>
+                    <w:tblLayout w:type="fixed"/>
+                    <w:tblLook w:firstColumn="1" w:firstRow="1" w:lastColumn="0" w:lastRow="0" w:noHBand="0" w:noVBand="1" w:val="04A0"/>
+                  </w:tblPr>
+                  <w:tblGrid>
+                    <w:gridCol w:w="198"/>
+                    <w:gridCol w:w="198"/>
+                  </w:tblGrid>
+                  <w:tr>
+                    <w:trPr>
+                      <w:trHeight w:val="198" w:hRule="exact"/>
+                    </w:trPr>
+                    <w:tc>
+                      <w:tcPr>
+                        <w:tcW w:type="dxa" w:w="198"/>
+                        <w:tcBorders>
+                          <w:top w:val="single" w:sz="12" w:space="0" w:color="000000"/>
+                          <w:left w:val="single" w:sz="12" w:space="0" w:color="000000"/>
+                          <w:bottom w:val="dashed" w:sz="6" w:space="0" w:color="808080"/>
+                          <w:right w:val="dashed" w:sz="6" w:space="0" w:color="808080"/>
+                        </w:tcBorders>
+                      </w:tcPr>
+                      <w:p>
+                        <w:pPr>
+                          <w:spacing w:before="0" w:after="0"/>
+                        </w:pPr>
+                        <w:r/>
+                        <w:r>
+                          <w:rPr>
+                            <w:rFonts w:ascii="宋体" w:hAnsi="宋体" w:eastAsia="宋体"/>
+                            <w:b w:val="0"/>
+                            <w:color w:val="1C1917"/>
+                            <w:sz w:val="12"/>
+                          </w:rPr>
+                          <w:t xml:space="preserve"> </w:t>
+                        </w:r>
+                      </w:p>
+                    </w:tc>
+                    <w:tc>
+                      <w:tcPr>
+                        <w:tcW w:type="dxa" w:w="198"/>
+                        <w:tcBorders>
+                          <w:top w:val="single" w:sz="12" w:space="0" w:color="000000"/>
+                          <w:left w:val="dashed" w:sz="6" w:space="0" w:color="808080"/>
+                          <w:bottom w:val="dashed" w:sz="6" w:space="0" w:color="808080"/>
+                          <w:right w:val="single" w:sz="12" w:space="0" w:color="000000"/>
+                        </w:tcBorders>
+                      </w:tcPr>
+                      <w:p>
+                        <w:pPr>
+                          <w:spacing w:before="0" w:after="0"/>
+                        </w:pPr>
+                        <w:r/>
+                        <w:r>
+                          <w:rPr>
+                            <w:rFonts w:ascii="宋体" w:hAnsi="宋体" w:eastAsia="宋体"/>
+                            <w:b w:val="0"/>
+                            <w:color w:val="1C1917"/>
+                            <w:sz w:val="12"/>
+                          </w:rPr>
+                          <w:t xml:space="preserve"> </w:t>
+                        </w:r>
+                      </w:p>
+                    </w:tc>
+                  </w:tr>
+                  <w:tr>
+                    <w:trPr>
+                      <w:trHeight w:val="198" w:hRule="exact"/>
+                    </w:trPr>
+                    <w:tc>
+                      <w:tcPr>
+                        <w:tcW w:type="dxa" w:w="198"/>
+                        <w:tcBorders>
+                          <w:top w:val="dashed" w:sz="6" w:space="0" w:color="808080"/>
+                          <w:left w:val="single" w:sz="12" w:space="0" w:color="000000"/>
+                          <w:bottom w:val="single" w:sz="12" w:space="0" w:color="000000"/>
+                          <w:right w:val="dashed" w:sz="6" w:space="0" w:color="808080"/>
+                        </w:tcBorders>
+                      </w:tcPr>
+                      <w:p>
+                        <w:pPr>
+                          <w:spacing w:before="0" w:after="0"/>
+                        </w:pPr>
+                        <w:r/>
+                        <w:r>
+                          <w:rPr>
+                            <w:rFonts w:ascii="宋体" w:hAnsi="宋体" w:eastAsia="宋体"/>
+                            <w:b w:val="0"/>
+                            <w:color w:val="1C1917"/>
+                            <w:sz w:val="12"/>
+                          </w:rPr>
+                          <w:t xml:space="preserve"> </w:t>
+                        </w:r>
+                      </w:p>
+                    </w:tc>
+                    <w:tc>
+                      <w:tcPr>
+                        <w:tcW w:type="dxa" w:w="198"/>
+                        <w:tcBorders>
+                          <w:top w:val="dashed" w:sz="6" w:space="0" w:color="808080"/>
+                          <w:left w:val="dashed" w:sz="6" w:space="0" w:color="808080"/>
+                          <w:bottom w:val="single" w:sz="12" w:space="0" w:color="000000"/>
+                          <w:right w:val="single" w:sz="12" w:space="0" w:color="000000"/>
+                        </w:tcBorders>
+                      </w:tcPr>
+                      <w:p>
+                        <w:pPr>
+                          <w:spacing w:before="0" w:after="0"/>
+                        </w:pPr>
+                        <w:r/>
+                        <w:r>
+                          <w:rPr>
+                            <w:rFonts w:ascii="宋体" w:hAnsi="宋体" w:eastAsia="宋体"/>
+                            <w:b w:val="0"/>
+                            <w:color w:val="1C1917"/>
+                            <w:sz w:val="12"/>
+                          </w:rPr>
+                          <w:t xml:space="preserve"> </w:t>
+                        </w:r>
+                      </w:p>
+                    </w:tc>
+                  </w:tr>
+                </w:tbl>
+                <w:p/>
+              </w:tc>
+            </w:tr>
+          </w:tbl>
+          <w:p/>
+        </w:tc>
+        <w:tc>
+          <w:tcPr>
+            <w:tcW w:type="dxa" w:w="5182"/>
+            <w:vAlign w:val="center"/>
+            <w:tcBorders/>
+          </w:tcPr>
+          <w:p>
+            <w:pPr>
+              <w:spacing w:before="0" w:after="0"/>
+              <w:jc w:val="left"/>
             </w:pPr>
             <w:r/>
             <w:r>
@@ -250,9 +820,348 @@
                 <w:rFonts w:ascii="宋体" w:hAnsi="宋体" w:eastAsia="宋体"/>
                 <w:b w:val="0"/>
                 <w:color w:val="1C1917"/>
-                <w:sz w:val="28"/>
+                <w:sz w:val="21"/>
               </w:rPr>
-              <w:t xml:space="preserve">　</w:t>
+              <w:t>了，我好像看见无数萤火虫在我的周围</w:t>
+            </w:r>
+          </w:p>
+        </w:tc>
+        <w:tc>
+          <w:tcPr>
+            <w:tcW w:type="dxa" w:w="907"/>
+            <w:vAlign w:val="center"/>
+            <w:tcBorders/>
+          </w:tcPr>
+          <w:p>
+            <w:pPr>
+              <w:spacing w:before="0" w:after="0"/>
+              <w:jc w:val="center"/>
+            </w:pPr>
+            <w:r/>
+            <w:r>
+              <w:rPr>
+                <w:rFonts w:ascii="Times New Roman" w:hAnsi="Times New Roman" w:eastAsia="宋体"/>
+                <w:b w:val="0"/>
+                <w:color w:val="1C1917"/>
+                <w:sz w:val="17"/>
+              </w:rPr>
+              <w:t>fēi wǔ</w:t>
+            </w:r>
+          </w:p>
+          <w:tbl>
+            <w:tblPr>
+              <w:tblW w:type="auto" w:w="0"/>
+              <w:tblLayout w:type="fixed"/>
+              <w:tblLook w:firstColumn="1" w:firstRow="1" w:lastColumn="0" w:lastRow="0" w:noHBand="0" w:noVBand="1" w:val="04A0"/>
+            </w:tblPr>
+            <w:tblGrid>
+              <w:gridCol w:w="453"/>
+              <w:gridCol w:w="453"/>
+            </w:tblGrid>
+            <w:tr>
+              <w:trPr>
+                <w:trHeight w:val="396" w:hRule="exact"/>
+              </w:trPr>
+              <w:tc>
+                <w:tcPr>
+                  <w:tcW w:type="dxa" w:w="397"/>
+                  <w:tcBorders/>
+                </w:tcPr>
+                <w:p>
+                  <w:pPr>
+                    <w:spacing w:before="0" w:after="0"/>
+                  </w:pPr>
+                  <w:r/>
+                </w:p>
+                <w:tbl>
+                  <w:tblPr>
+                    <w:tblW w:type="auto" w:w="0"/>
+                    <w:tblLayout w:type="fixed"/>
+                    <w:tblLook w:firstColumn="1" w:firstRow="1" w:lastColumn="0" w:lastRow="0" w:noHBand="0" w:noVBand="1" w:val="04A0"/>
+                  </w:tblPr>
+                  <w:tblGrid>
+                    <w:gridCol w:w="198"/>
+                    <w:gridCol w:w="198"/>
+                  </w:tblGrid>
+                  <w:tr>
+                    <w:trPr>
+                      <w:trHeight w:val="198" w:hRule="exact"/>
+                    </w:trPr>
+                    <w:tc>
+                      <w:tcPr>
+                        <w:tcW w:type="dxa" w:w="198"/>
+                        <w:tcBorders>
+                          <w:top w:val="single" w:sz="12" w:space="0" w:color="000000"/>
+                          <w:left w:val="single" w:sz="12" w:space="0" w:color="000000"/>
+                          <w:bottom w:val="dashed" w:sz="6" w:space="0" w:color="808080"/>
+                          <w:right w:val="dashed" w:sz="6" w:space="0" w:color="808080"/>
+                        </w:tcBorders>
+                      </w:tcPr>
+                      <w:p>
+                        <w:pPr>
+                          <w:spacing w:before="0" w:after="0"/>
+                        </w:pPr>
+                        <w:r/>
+                        <w:r>
+                          <w:rPr>
+                            <w:rFonts w:ascii="宋体" w:hAnsi="宋体" w:eastAsia="宋体"/>
+                            <w:b w:val="0"/>
+                            <w:color w:val="1C1917"/>
+                            <w:sz w:val="12"/>
+                          </w:rPr>
+                          <w:t xml:space="preserve"> </w:t>
+                        </w:r>
+                      </w:p>
+                    </w:tc>
+                    <w:tc>
+                      <w:tcPr>
+                        <w:tcW w:type="dxa" w:w="198"/>
+                        <w:tcBorders>
+                          <w:top w:val="single" w:sz="12" w:space="0" w:color="000000"/>
+                          <w:left w:val="dashed" w:sz="6" w:space="0" w:color="808080"/>
+                          <w:bottom w:val="dashed" w:sz="6" w:space="0" w:color="808080"/>
+                          <w:right w:val="single" w:sz="12" w:space="0" w:color="000000"/>
+                        </w:tcBorders>
+                      </w:tcPr>
+                      <w:p>
+                        <w:pPr>
+                          <w:spacing w:before="0" w:after="0"/>
+                        </w:pPr>
+                        <w:r/>
+                        <w:r>
+                          <w:rPr>
+                            <w:rFonts w:ascii="宋体" w:hAnsi="宋体" w:eastAsia="宋体"/>
+                            <w:b w:val="0"/>
+                            <w:color w:val="1C1917"/>
+                            <w:sz w:val="12"/>
+                          </w:rPr>
+                          <w:t xml:space="preserve"> </w:t>
+                        </w:r>
+                      </w:p>
+                    </w:tc>
+                  </w:tr>
+                  <w:tr>
+                    <w:trPr>
+                      <w:trHeight w:val="198" w:hRule="exact"/>
+                    </w:trPr>
+                    <w:tc>
+                      <w:tcPr>
+                        <w:tcW w:type="dxa" w:w="198"/>
+                        <w:tcBorders>
+                          <w:top w:val="dashed" w:sz="6" w:space="0" w:color="808080"/>
+                          <w:left w:val="single" w:sz="12" w:space="0" w:color="000000"/>
+                          <w:bottom w:val="single" w:sz="12" w:space="0" w:color="000000"/>
+                          <w:right w:val="dashed" w:sz="6" w:space="0" w:color="808080"/>
+                        </w:tcBorders>
+                      </w:tcPr>
+                      <w:p>
+                        <w:pPr>
+                          <w:spacing w:before="0" w:after="0"/>
+                        </w:pPr>
+                        <w:r/>
+                        <w:r>
+                          <w:rPr>
+                            <w:rFonts w:ascii="宋体" w:hAnsi="宋体" w:eastAsia="宋体"/>
+                            <w:b w:val="0"/>
+                            <w:color w:val="1C1917"/>
+                            <w:sz w:val="12"/>
+                          </w:rPr>
+                          <w:t xml:space="preserve"> </w:t>
+                        </w:r>
+                      </w:p>
+                    </w:tc>
+                    <w:tc>
+                      <w:tcPr>
+                        <w:tcW w:type="dxa" w:w="198"/>
+                        <w:tcBorders>
+                          <w:top w:val="dashed" w:sz="6" w:space="0" w:color="808080"/>
+                          <w:left w:val="dashed" w:sz="6" w:space="0" w:color="808080"/>
+                          <w:bottom w:val="single" w:sz="12" w:space="0" w:color="000000"/>
+                          <w:right w:val="single" w:sz="12" w:space="0" w:color="000000"/>
+                        </w:tcBorders>
+                      </w:tcPr>
+                      <w:p>
+                        <w:pPr>
+                          <w:spacing w:before="0" w:after="0"/>
+                        </w:pPr>
+                        <w:r/>
+                        <w:r>
+                          <w:rPr>
+                            <w:rFonts w:ascii="宋体" w:hAnsi="宋体" w:eastAsia="宋体"/>
+                            <w:b w:val="0"/>
+                            <w:color w:val="1C1917"/>
+                            <w:sz w:val="12"/>
+                          </w:rPr>
+                          <w:t xml:space="preserve"> </w:t>
+                        </w:r>
+                      </w:p>
+                    </w:tc>
+                  </w:tr>
+                </w:tbl>
+                <w:p/>
+              </w:tc>
+              <w:tc>
+                <w:tcPr>
+                  <w:tcW w:type="dxa" w:w="397"/>
+                  <w:tcBorders/>
+                </w:tcPr>
+                <w:p>
+                  <w:pPr>
+                    <w:spacing w:before="0" w:after="0"/>
+                  </w:pPr>
+                  <w:r/>
+                </w:p>
+                <w:tbl>
+                  <w:tblPr>
+                    <w:tblW w:type="auto" w:w="0"/>
+                    <w:tblLayout w:type="fixed"/>
+                    <w:tblLook w:firstColumn="1" w:firstRow="1" w:lastColumn="0" w:lastRow="0" w:noHBand="0" w:noVBand="1" w:val="04A0"/>
+                  </w:tblPr>
+                  <w:tblGrid>
+                    <w:gridCol w:w="198"/>
+                    <w:gridCol w:w="198"/>
+                  </w:tblGrid>
+                  <w:tr>
+                    <w:trPr>
+                      <w:trHeight w:val="198" w:hRule="exact"/>
+                    </w:trPr>
+                    <w:tc>
+                      <w:tcPr>
+                        <w:tcW w:type="dxa" w:w="198"/>
+                        <w:tcBorders>
+                          <w:top w:val="single" w:sz="12" w:space="0" w:color="000000"/>
+                          <w:left w:val="single" w:sz="12" w:space="0" w:color="000000"/>
+                          <w:bottom w:val="dashed" w:sz="6" w:space="0" w:color="808080"/>
+                          <w:right w:val="dashed" w:sz="6" w:space="0" w:color="808080"/>
+                        </w:tcBorders>
+                      </w:tcPr>
+                      <w:p>
+                        <w:pPr>
+                          <w:spacing w:before="0" w:after="0"/>
+                        </w:pPr>
+                        <w:r/>
+                        <w:r>
+                          <w:rPr>
+                            <w:rFonts w:ascii="宋体" w:hAnsi="宋体" w:eastAsia="宋体"/>
+                            <w:b w:val="0"/>
+                            <w:color w:val="1C1917"/>
+                            <w:sz w:val="12"/>
+                          </w:rPr>
+                          <w:t xml:space="preserve"> </w:t>
+                        </w:r>
+                      </w:p>
+                    </w:tc>
+                    <w:tc>
+                      <w:tcPr>
+                        <w:tcW w:type="dxa" w:w="198"/>
+                        <w:tcBorders>
+                          <w:top w:val="single" w:sz="12" w:space="0" w:color="000000"/>
+                          <w:left w:val="dashed" w:sz="6" w:space="0" w:color="808080"/>
+                          <w:bottom w:val="dashed" w:sz="6" w:space="0" w:color="808080"/>
+                          <w:right w:val="single" w:sz="12" w:space="0" w:color="000000"/>
+                        </w:tcBorders>
+                      </w:tcPr>
+                      <w:p>
+                        <w:pPr>
+                          <w:spacing w:before="0" w:after="0"/>
+                        </w:pPr>
+                        <w:r/>
+                        <w:r>
+                          <w:rPr>
+                            <w:rFonts w:ascii="宋体" w:hAnsi="宋体" w:eastAsia="宋体"/>
+                            <w:b w:val="0"/>
+                            <w:color w:val="1C1917"/>
+                            <w:sz w:val="12"/>
+                          </w:rPr>
+                          <w:t xml:space="preserve"> </w:t>
+                        </w:r>
+                      </w:p>
+                    </w:tc>
+                  </w:tr>
+                  <w:tr>
+                    <w:trPr>
+                      <w:trHeight w:val="198" w:hRule="exact"/>
+                    </w:trPr>
+                    <w:tc>
+                      <w:tcPr>
+                        <w:tcW w:type="dxa" w:w="198"/>
+                        <w:tcBorders>
+                          <w:top w:val="dashed" w:sz="6" w:space="0" w:color="808080"/>
+                          <w:left w:val="single" w:sz="12" w:space="0" w:color="000000"/>
+                          <w:bottom w:val="single" w:sz="12" w:space="0" w:color="000000"/>
+                          <w:right w:val="dashed" w:sz="6" w:space="0" w:color="808080"/>
+                        </w:tcBorders>
+                      </w:tcPr>
+                      <w:p>
+                        <w:pPr>
+                          <w:spacing w:before="0" w:after="0"/>
+                        </w:pPr>
+                        <w:r/>
+                        <w:r>
+                          <w:rPr>
+                            <w:rFonts w:ascii="宋体" w:hAnsi="宋体" w:eastAsia="宋体"/>
+                            <w:b w:val="0"/>
+                            <w:color w:val="1C1917"/>
+                            <w:sz w:val="12"/>
+                          </w:rPr>
+                          <w:t xml:space="preserve"> </w:t>
+                        </w:r>
+                      </w:p>
+                    </w:tc>
+                    <w:tc>
+                      <w:tcPr>
+                        <w:tcW w:type="dxa" w:w="198"/>
+                        <w:tcBorders>
+                          <w:top w:val="dashed" w:sz="6" w:space="0" w:color="808080"/>
+                          <w:left w:val="dashed" w:sz="6" w:space="0" w:color="808080"/>
+                          <w:bottom w:val="single" w:sz="12" w:space="0" w:color="000000"/>
+                          <w:right w:val="single" w:sz="12" w:space="0" w:color="000000"/>
+                        </w:tcBorders>
+                      </w:tcPr>
+                      <w:p>
+                        <w:pPr>
+                          <w:spacing w:before="0" w:after="0"/>
+                        </w:pPr>
+                        <w:r/>
+                        <w:r>
+                          <w:rPr>
+                            <w:rFonts w:ascii="宋体" w:hAnsi="宋体" w:eastAsia="宋体"/>
+                            <w:b w:val="0"/>
+                            <w:color w:val="1C1917"/>
+                            <w:sz w:val="12"/>
+                          </w:rPr>
+                          <w:t xml:space="preserve"> </w:t>
+                        </w:r>
+                      </w:p>
+                    </w:tc>
+                  </w:tr>
+                </w:tbl>
+                <w:p/>
+              </w:tc>
+            </w:tr>
+          </w:tbl>
+          <w:p/>
+        </w:tc>
+        <w:tc>
+          <w:tcPr>
+            <w:tcW w:type="dxa" w:w="465"/>
+            <w:vAlign w:val="center"/>
+            <w:tcBorders/>
+          </w:tcPr>
+          <w:p>
+            <w:pPr>
+              <w:spacing w:before="0" w:after="0"/>
+              <w:jc w:val="left"/>
+            </w:pPr>
+            <w:r/>
+            <w:r>
+              <w:rPr>
+                <w:rFonts w:ascii="宋体" w:hAnsi="宋体" w:eastAsia="宋体"/>
+                <w:b w:val="0"/>
+                <w:color w:val="1C1917"/>
+                <w:sz w:val="21"/>
+              </w:rPr>
+              <w:t>。</w:t>
             </w:r>
           </w:p>
         </w:tc>
@@ -260,65 +1169,45 @@
     </w:tbl>
     <w:p>
       <w:pPr>
-        <w:spacing w:before="0" w:after="60"/>
+        <w:spacing w:before="0" w:after="40"/>
       </w:pPr>
-    </w:p>
-    <w:p>
-      <w:pPr>
-        <w:spacing w:before="0" w:after="20" w:line="276" w:lineRule="auto"/>
-      </w:pPr>
-      <w:r>
-        <w:rPr>
-          <w:rFonts w:ascii="宋体" w:hAnsi="宋体" w:eastAsia="宋体"/>
-          <w:b w:val="0"/>
-          <w:color w:val="1C1917"/>
-          <w:sz w:val="21"/>
-        </w:rPr>
-        <w:t>了，我好像看见无数萤火虫在我的周围</w:t>
-      </w:r>
-    </w:p>
-    <w:p>
-      <w:pPr>
-        <w:spacing w:before="20" w:after="20" w:line="240" w:lineRule="auto"/>
-      </w:pPr>
-      <w:r>
-        <w:rPr>
-          <w:rFonts w:ascii="Times New Roman" w:hAnsi="Times New Roman" w:eastAsia="宋体"/>
-          <w:b w:val="0"/>
-          <w:color w:val="1C1917"/>
-          <w:sz w:val="20"/>
-        </w:rPr>
-        <w:t>fēi wǔ</w:t>
-      </w:r>
     </w:p>
     <w:tbl>
       <w:tblPr>
         <w:tblW w:type="auto" w:w="0"/>
         <w:jc w:val="left"/>
-        <w:tblLayout w:type="fixed"/>
+        <w:tblLayout w:type="autofit"/>
         <w:tblLook w:firstColumn="1" w:firstRow="1" w:lastColumn="0" w:lastRow="0" w:noHBand="0" w:noVBand="1" w:val="04A0"/>
+        <w:tblBorders>
+          <w:top w:val="nil"/>
+          <w:left w:val="nil"/>
+          <w:bottom w:val="nil"/>
+          <w:right w:val="nil"/>
+          <w:insideH w:val="nil"/>
+          <w:insideV w:val="nil"/>
+        </w:tblBorders>
       </w:tblPr>
       <w:tblGrid>
-        <w:gridCol w:w="5103"/>
-        <w:gridCol w:w="5103"/>
+        <w:gridCol w:w="1996"/>
+        <w:gridCol w:w="1996"/>
+        <w:gridCol w:w="1996"/>
+        <w:gridCol w:w="1996"/>
+        <w:gridCol w:w="1996"/>
       </w:tblGrid>
       <w:tr>
         <w:trPr>
-          <w:trHeight w:val="464" w:hRule="atLeast"/>
+          <w:trHeight w:val="612" w:hRule="atLeast"/>
         </w:trPr>
         <w:tc>
           <w:tcPr>
-            <w:tcW w:type="dxa" w:w="465"/>
-            <w:tcBorders>
-              <w:top w:val="single" w:sz="12" w:space="0" w:color="000000"/>
-              <w:left w:val="single" w:sz="12" w:space="0" w:color="000000"/>
-              <w:bottom w:val="single" w:sz="12" w:space="0" w:color="000000"/>
-              <w:right w:val="single" w:sz="12" w:space="0" w:color="000000"/>
-            </w:tcBorders>
+            <w:tcW w:type="dxa" w:w="1644"/>
+            <w:vAlign w:val="center"/>
+            <w:tcBorders/>
           </w:tcPr>
           <w:p>
             <w:pPr>
               <w:spacing w:before="0" w:after="0"/>
+              <w:jc w:val="left"/>
             </w:pPr>
             <w:r/>
             <w:r>
@@ -326,25 +1215,338 @@
                 <w:rFonts w:ascii="宋体" w:hAnsi="宋体" w:eastAsia="宋体"/>
                 <w:b w:val="0"/>
                 <w:color w:val="1C1917"/>
-                <w:sz w:val="28"/>
+                <w:sz w:val="21"/>
               </w:rPr>
-              <w:t xml:space="preserve">　</w:t>
+              <w:t>海上的夜是</w:t>
             </w:r>
           </w:p>
         </w:tc>
         <w:tc>
           <w:tcPr>
-            <w:tcW w:type="dxa" w:w="465"/>
-            <w:tcBorders>
-              <w:top w:val="single" w:sz="12" w:space="0" w:color="000000"/>
-              <w:left w:val="single" w:sz="12" w:space="0" w:color="000000"/>
-              <w:bottom w:val="single" w:sz="12" w:space="0" w:color="000000"/>
-              <w:right w:val="single" w:sz="12" w:space="0" w:color="000000"/>
-            </w:tcBorders>
+            <w:tcW w:type="dxa" w:w="907"/>
+            <w:vAlign w:val="center"/>
+            <w:tcBorders/>
           </w:tcPr>
           <w:p>
             <w:pPr>
               <w:spacing w:before="0" w:after="0"/>
+              <w:jc w:val="center"/>
+            </w:pPr>
+            <w:r/>
+            <w:r>
+              <w:rPr>
+                <w:rFonts w:ascii="Times New Roman" w:hAnsi="Times New Roman" w:eastAsia="宋体"/>
+                <w:b w:val="0"/>
+                <w:color w:val="1C1917"/>
+                <w:sz w:val="17"/>
+              </w:rPr>
+              <w:t>róu hé</w:t>
+            </w:r>
+          </w:p>
+          <w:tbl>
+            <w:tblPr>
+              <w:tblW w:type="auto" w:w="0"/>
+              <w:tblLayout w:type="fixed"/>
+              <w:tblLook w:firstColumn="1" w:firstRow="1" w:lastColumn="0" w:lastRow="0" w:noHBand="0" w:noVBand="1" w:val="04A0"/>
+            </w:tblPr>
+            <w:tblGrid>
+              <w:gridCol w:w="453"/>
+              <w:gridCol w:w="453"/>
+            </w:tblGrid>
+            <w:tr>
+              <w:trPr>
+                <w:trHeight w:val="396" w:hRule="exact"/>
+              </w:trPr>
+              <w:tc>
+                <w:tcPr>
+                  <w:tcW w:type="dxa" w:w="397"/>
+                  <w:tcBorders/>
+                </w:tcPr>
+                <w:p>
+                  <w:pPr>
+                    <w:spacing w:before="0" w:after="0"/>
+                  </w:pPr>
+                  <w:r/>
+                </w:p>
+                <w:tbl>
+                  <w:tblPr>
+                    <w:tblW w:type="auto" w:w="0"/>
+                    <w:tblLayout w:type="fixed"/>
+                    <w:tblLook w:firstColumn="1" w:firstRow="1" w:lastColumn="0" w:lastRow="0" w:noHBand="0" w:noVBand="1" w:val="04A0"/>
+                  </w:tblPr>
+                  <w:tblGrid>
+                    <w:gridCol w:w="198"/>
+                    <w:gridCol w:w="198"/>
+                  </w:tblGrid>
+                  <w:tr>
+                    <w:trPr>
+                      <w:trHeight w:val="198" w:hRule="exact"/>
+                    </w:trPr>
+                    <w:tc>
+                      <w:tcPr>
+                        <w:tcW w:type="dxa" w:w="198"/>
+                        <w:tcBorders>
+                          <w:top w:val="single" w:sz="12" w:space="0" w:color="000000"/>
+                          <w:left w:val="single" w:sz="12" w:space="0" w:color="000000"/>
+                          <w:bottom w:val="dashed" w:sz="6" w:space="0" w:color="808080"/>
+                          <w:right w:val="dashed" w:sz="6" w:space="0" w:color="808080"/>
+                        </w:tcBorders>
+                      </w:tcPr>
+                      <w:p>
+                        <w:pPr>
+                          <w:spacing w:before="0" w:after="0"/>
+                        </w:pPr>
+                        <w:r/>
+                        <w:r>
+                          <w:rPr>
+                            <w:rFonts w:ascii="宋体" w:hAnsi="宋体" w:eastAsia="宋体"/>
+                            <w:b w:val="0"/>
+                            <w:color w:val="1C1917"/>
+                            <w:sz w:val="12"/>
+                          </w:rPr>
+                          <w:t xml:space="preserve"> </w:t>
+                        </w:r>
+                      </w:p>
+                    </w:tc>
+                    <w:tc>
+                      <w:tcPr>
+                        <w:tcW w:type="dxa" w:w="198"/>
+                        <w:tcBorders>
+                          <w:top w:val="single" w:sz="12" w:space="0" w:color="000000"/>
+                          <w:left w:val="dashed" w:sz="6" w:space="0" w:color="808080"/>
+                          <w:bottom w:val="dashed" w:sz="6" w:space="0" w:color="808080"/>
+                          <w:right w:val="single" w:sz="12" w:space="0" w:color="000000"/>
+                        </w:tcBorders>
+                      </w:tcPr>
+                      <w:p>
+                        <w:pPr>
+                          <w:spacing w:before="0" w:after="0"/>
+                        </w:pPr>
+                        <w:r/>
+                        <w:r>
+                          <w:rPr>
+                            <w:rFonts w:ascii="宋体" w:hAnsi="宋体" w:eastAsia="宋体"/>
+                            <w:b w:val="0"/>
+                            <w:color w:val="1C1917"/>
+                            <w:sz w:val="12"/>
+                          </w:rPr>
+                          <w:t xml:space="preserve"> </w:t>
+                        </w:r>
+                      </w:p>
+                    </w:tc>
+                  </w:tr>
+                  <w:tr>
+                    <w:trPr>
+                      <w:trHeight w:val="198" w:hRule="exact"/>
+                    </w:trPr>
+                    <w:tc>
+                      <w:tcPr>
+                        <w:tcW w:type="dxa" w:w="198"/>
+                        <w:tcBorders>
+                          <w:top w:val="dashed" w:sz="6" w:space="0" w:color="808080"/>
+                          <w:left w:val="single" w:sz="12" w:space="0" w:color="000000"/>
+                          <w:bottom w:val="single" w:sz="12" w:space="0" w:color="000000"/>
+                          <w:right w:val="dashed" w:sz="6" w:space="0" w:color="808080"/>
+                        </w:tcBorders>
+                      </w:tcPr>
+                      <w:p>
+                        <w:pPr>
+                          <w:spacing w:before="0" w:after="0"/>
+                        </w:pPr>
+                        <w:r/>
+                        <w:r>
+                          <w:rPr>
+                            <w:rFonts w:ascii="宋体" w:hAnsi="宋体" w:eastAsia="宋体"/>
+                            <w:b w:val="0"/>
+                            <w:color w:val="1C1917"/>
+                            <w:sz w:val="12"/>
+                          </w:rPr>
+                          <w:t xml:space="preserve"> </w:t>
+                        </w:r>
+                      </w:p>
+                    </w:tc>
+                    <w:tc>
+                      <w:tcPr>
+                        <w:tcW w:type="dxa" w:w="198"/>
+                        <w:tcBorders>
+                          <w:top w:val="dashed" w:sz="6" w:space="0" w:color="808080"/>
+                          <w:left w:val="dashed" w:sz="6" w:space="0" w:color="808080"/>
+                          <w:bottom w:val="single" w:sz="12" w:space="0" w:color="000000"/>
+                          <w:right w:val="single" w:sz="12" w:space="0" w:color="000000"/>
+                        </w:tcBorders>
+                      </w:tcPr>
+                      <w:p>
+                        <w:pPr>
+                          <w:spacing w:before="0" w:after="0"/>
+                        </w:pPr>
+                        <w:r/>
+                        <w:r>
+                          <w:rPr>
+                            <w:rFonts w:ascii="宋体" w:hAnsi="宋体" w:eastAsia="宋体"/>
+                            <w:b w:val="0"/>
+                            <w:color w:val="1C1917"/>
+                            <w:sz w:val="12"/>
+                          </w:rPr>
+                          <w:t xml:space="preserve"> </w:t>
+                        </w:r>
+                      </w:p>
+                    </w:tc>
+                  </w:tr>
+                </w:tbl>
+                <w:p/>
+              </w:tc>
+              <w:tc>
+                <w:tcPr>
+                  <w:tcW w:type="dxa" w:w="397"/>
+                  <w:tcBorders/>
+                </w:tcPr>
+                <w:p>
+                  <w:pPr>
+                    <w:spacing w:before="0" w:after="0"/>
+                  </w:pPr>
+                  <w:r/>
+                </w:p>
+                <w:tbl>
+                  <w:tblPr>
+                    <w:tblW w:type="auto" w:w="0"/>
+                    <w:tblLayout w:type="fixed"/>
+                    <w:tblLook w:firstColumn="1" w:firstRow="1" w:lastColumn="0" w:lastRow="0" w:noHBand="0" w:noVBand="1" w:val="04A0"/>
+                  </w:tblPr>
+                  <w:tblGrid>
+                    <w:gridCol w:w="198"/>
+                    <w:gridCol w:w="198"/>
+                  </w:tblGrid>
+                  <w:tr>
+                    <w:trPr>
+                      <w:trHeight w:val="198" w:hRule="exact"/>
+                    </w:trPr>
+                    <w:tc>
+                      <w:tcPr>
+                        <w:tcW w:type="dxa" w:w="198"/>
+                        <w:tcBorders>
+                          <w:top w:val="single" w:sz="12" w:space="0" w:color="000000"/>
+                          <w:left w:val="single" w:sz="12" w:space="0" w:color="000000"/>
+                          <w:bottom w:val="dashed" w:sz="6" w:space="0" w:color="808080"/>
+                          <w:right w:val="dashed" w:sz="6" w:space="0" w:color="808080"/>
+                        </w:tcBorders>
+                      </w:tcPr>
+                      <w:p>
+                        <w:pPr>
+                          <w:spacing w:before="0" w:after="0"/>
+                        </w:pPr>
+                        <w:r/>
+                        <w:r>
+                          <w:rPr>
+                            <w:rFonts w:ascii="宋体" w:hAnsi="宋体" w:eastAsia="宋体"/>
+                            <w:b w:val="0"/>
+                            <w:color w:val="1C1917"/>
+                            <w:sz w:val="12"/>
+                          </w:rPr>
+                          <w:t xml:space="preserve"> </w:t>
+                        </w:r>
+                      </w:p>
+                    </w:tc>
+                    <w:tc>
+                      <w:tcPr>
+                        <w:tcW w:type="dxa" w:w="198"/>
+                        <w:tcBorders>
+                          <w:top w:val="single" w:sz="12" w:space="0" w:color="000000"/>
+                          <w:left w:val="dashed" w:sz="6" w:space="0" w:color="808080"/>
+                          <w:bottom w:val="dashed" w:sz="6" w:space="0" w:color="808080"/>
+                          <w:right w:val="single" w:sz="12" w:space="0" w:color="000000"/>
+                        </w:tcBorders>
+                      </w:tcPr>
+                      <w:p>
+                        <w:pPr>
+                          <w:spacing w:before="0" w:after="0"/>
+                        </w:pPr>
+                        <w:r/>
+                        <w:r>
+                          <w:rPr>
+                            <w:rFonts w:ascii="宋体" w:hAnsi="宋体" w:eastAsia="宋体"/>
+                            <w:b w:val="0"/>
+                            <w:color w:val="1C1917"/>
+                            <w:sz w:val="12"/>
+                          </w:rPr>
+                          <w:t xml:space="preserve"> </w:t>
+                        </w:r>
+                      </w:p>
+                    </w:tc>
+                  </w:tr>
+                  <w:tr>
+                    <w:trPr>
+                      <w:trHeight w:val="198" w:hRule="exact"/>
+                    </w:trPr>
+                    <w:tc>
+                      <w:tcPr>
+                        <w:tcW w:type="dxa" w:w="198"/>
+                        <w:tcBorders>
+                          <w:top w:val="dashed" w:sz="6" w:space="0" w:color="808080"/>
+                          <w:left w:val="single" w:sz="12" w:space="0" w:color="000000"/>
+                          <w:bottom w:val="single" w:sz="12" w:space="0" w:color="000000"/>
+                          <w:right w:val="dashed" w:sz="6" w:space="0" w:color="808080"/>
+                        </w:tcBorders>
+                      </w:tcPr>
+                      <w:p>
+                        <w:pPr>
+                          <w:spacing w:before="0" w:after="0"/>
+                        </w:pPr>
+                        <w:r/>
+                        <w:r>
+                          <w:rPr>
+                            <w:rFonts w:ascii="宋体" w:hAnsi="宋体" w:eastAsia="宋体"/>
+                            <w:b w:val="0"/>
+                            <w:color w:val="1C1917"/>
+                            <w:sz w:val="12"/>
+                          </w:rPr>
+                          <w:t xml:space="preserve"> </w:t>
+                        </w:r>
+                      </w:p>
+                    </w:tc>
+                    <w:tc>
+                      <w:tcPr>
+                        <w:tcW w:type="dxa" w:w="198"/>
+                        <w:tcBorders>
+                          <w:top w:val="dashed" w:sz="6" w:space="0" w:color="808080"/>
+                          <w:left w:val="dashed" w:sz="6" w:space="0" w:color="808080"/>
+                          <w:bottom w:val="single" w:sz="12" w:space="0" w:color="000000"/>
+                          <w:right w:val="single" w:sz="12" w:space="0" w:color="000000"/>
+                        </w:tcBorders>
+                      </w:tcPr>
+                      <w:p>
+                        <w:pPr>
+                          <w:spacing w:before="0" w:after="0"/>
+                        </w:pPr>
+                        <w:r/>
+                        <w:r>
+                          <w:rPr>
+                            <w:rFonts w:ascii="宋体" w:hAnsi="宋体" w:eastAsia="宋体"/>
+                            <w:b w:val="0"/>
+                            <w:color w:val="1C1917"/>
+                            <w:sz w:val="12"/>
+                          </w:rPr>
+                          <w:t xml:space="preserve"> </w:t>
+                        </w:r>
+                      </w:p>
+                    </w:tc>
+                  </w:tr>
+                </w:tbl>
+                <w:p/>
+              </w:tc>
+            </w:tr>
+          </w:tbl>
+          <w:p/>
+        </w:tc>
+        <w:tc>
+          <w:tcPr>
+            <w:tcW w:type="dxa" w:w="2529"/>
+            <w:vAlign w:val="center"/>
+            <w:tcBorders/>
+          </w:tcPr>
+          <w:p>
+            <w:pPr>
+              <w:spacing w:before="0" w:after="0"/>
+              <w:jc w:val="left"/>
             </w:pPr>
             <w:r/>
             <w:r>
@@ -352,9 +1554,348 @@
                 <w:rFonts w:ascii="宋体" w:hAnsi="宋体" w:eastAsia="宋体"/>
                 <w:b w:val="0"/>
                 <w:color w:val="1C1917"/>
-                <w:sz w:val="28"/>
+                <w:sz w:val="21"/>
               </w:rPr>
-              <w:t xml:space="preserve">　</w:t>
+              <w:t>的，是静寂的，是</w:t>
+            </w:r>
+          </w:p>
+        </w:tc>
+        <w:tc>
+          <w:tcPr>
+            <w:tcW w:type="dxa" w:w="907"/>
+            <w:vAlign w:val="center"/>
+            <w:tcBorders/>
+          </w:tcPr>
+          <w:p>
+            <w:pPr>
+              <w:spacing w:before="0" w:after="0"/>
+              <w:jc w:val="center"/>
+            </w:pPr>
+            <w:r/>
+            <w:r>
+              <w:rPr>
+                <w:rFonts w:ascii="Times New Roman" w:hAnsi="Times New Roman" w:eastAsia="宋体"/>
+                <w:b w:val="0"/>
+                <w:color w:val="1C1917"/>
+                <w:sz w:val="17"/>
+              </w:rPr>
+              <w:t>mèng huàn</w:t>
+            </w:r>
+          </w:p>
+          <w:tbl>
+            <w:tblPr>
+              <w:tblW w:type="auto" w:w="0"/>
+              <w:tblLayout w:type="fixed"/>
+              <w:tblLook w:firstColumn="1" w:firstRow="1" w:lastColumn="0" w:lastRow="0" w:noHBand="0" w:noVBand="1" w:val="04A0"/>
+            </w:tblPr>
+            <w:tblGrid>
+              <w:gridCol w:w="453"/>
+              <w:gridCol w:w="453"/>
+            </w:tblGrid>
+            <w:tr>
+              <w:trPr>
+                <w:trHeight w:val="396" w:hRule="exact"/>
+              </w:trPr>
+              <w:tc>
+                <w:tcPr>
+                  <w:tcW w:type="dxa" w:w="397"/>
+                  <w:tcBorders/>
+                </w:tcPr>
+                <w:p>
+                  <w:pPr>
+                    <w:spacing w:before="0" w:after="0"/>
+                  </w:pPr>
+                  <w:r/>
+                </w:p>
+                <w:tbl>
+                  <w:tblPr>
+                    <w:tblW w:type="auto" w:w="0"/>
+                    <w:tblLayout w:type="fixed"/>
+                    <w:tblLook w:firstColumn="1" w:firstRow="1" w:lastColumn="0" w:lastRow="0" w:noHBand="0" w:noVBand="1" w:val="04A0"/>
+                  </w:tblPr>
+                  <w:tblGrid>
+                    <w:gridCol w:w="198"/>
+                    <w:gridCol w:w="198"/>
+                  </w:tblGrid>
+                  <w:tr>
+                    <w:trPr>
+                      <w:trHeight w:val="198" w:hRule="exact"/>
+                    </w:trPr>
+                    <w:tc>
+                      <w:tcPr>
+                        <w:tcW w:type="dxa" w:w="198"/>
+                        <w:tcBorders>
+                          <w:top w:val="single" w:sz="12" w:space="0" w:color="000000"/>
+                          <w:left w:val="single" w:sz="12" w:space="0" w:color="000000"/>
+                          <w:bottom w:val="dashed" w:sz="6" w:space="0" w:color="808080"/>
+                          <w:right w:val="dashed" w:sz="6" w:space="0" w:color="808080"/>
+                        </w:tcBorders>
+                      </w:tcPr>
+                      <w:p>
+                        <w:pPr>
+                          <w:spacing w:before="0" w:after="0"/>
+                        </w:pPr>
+                        <w:r/>
+                        <w:r>
+                          <w:rPr>
+                            <w:rFonts w:ascii="宋体" w:hAnsi="宋体" w:eastAsia="宋体"/>
+                            <w:b w:val="0"/>
+                            <w:color w:val="1C1917"/>
+                            <w:sz w:val="12"/>
+                          </w:rPr>
+                          <w:t xml:space="preserve"> </w:t>
+                        </w:r>
+                      </w:p>
+                    </w:tc>
+                    <w:tc>
+                      <w:tcPr>
+                        <w:tcW w:type="dxa" w:w="198"/>
+                        <w:tcBorders>
+                          <w:top w:val="single" w:sz="12" w:space="0" w:color="000000"/>
+                          <w:left w:val="dashed" w:sz="6" w:space="0" w:color="808080"/>
+                          <w:bottom w:val="dashed" w:sz="6" w:space="0" w:color="808080"/>
+                          <w:right w:val="single" w:sz="12" w:space="0" w:color="000000"/>
+                        </w:tcBorders>
+                      </w:tcPr>
+                      <w:p>
+                        <w:pPr>
+                          <w:spacing w:before="0" w:after="0"/>
+                        </w:pPr>
+                        <w:r/>
+                        <w:r>
+                          <w:rPr>
+                            <w:rFonts w:ascii="宋体" w:hAnsi="宋体" w:eastAsia="宋体"/>
+                            <w:b w:val="0"/>
+                            <w:color w:val="1C1917"/>
+                            <w:sz w:val="12"/>
+                          </w:rPr>
+                          <w:t xml:space="preserve"> </w:t>
+                        </w:r>
+                      </w:p>
+                    </w:tc>
+                  </w:tr>
+                  <w:tr>
+                    <w:trPr>
+                      <w:trHeight w:val="198" w:hRule="exact"/>
+                    </w:trPr>
+                    <w:tc>
+                      <w:tcPr>
+                        <w:tcW w:type="dxa" w:w="198"/>
+                        <w:tcBorders>
+                          <w:top w:val="dashed" w:sz="6" w:space="0" w:color="808080"/>
+                          <w:left w:val="single" w:sz="12" w:space="0" w:color="000000"/>
+                          <w:bottom w:val="single" w:sz="12" w:space="0" w:color="000000"/>
+                          <w:right w:val="dashed" w:sz="6" w:space="0" w:color="808080"/>
+                        </w:tcBorders>
+                      </w:tcPr>
+                      <w:p>
+                        <w:pPr>
+                          <w:spacing w:before="0" w:after="0"/>
+                        </w:pPr>
+                        <w:r/>
+                        <w:r>
+                          <w:rPr>
+                            <w:rFonts w:ascii="宋体" w:hAnsi="宋体" w:eastAsia="宋体"/>
+                            <w:b w:val="0"/>
+                            <w:color w:val="1C1917"/>
+                            <w:sz w:val="12"/>
+                          </w:rPr>
+                          <w:t xml:space="preserve"> </w:t>
+                        </w:r>
+                      </w:p>
+                    </w:tc>
+                    <w:tc>
+                      <w:tcPr>
+                        <w:tcW w:type="dxa" w:w="198"/>
+                        <w:tcBorders>
+                          <w:top w:val="dashed" w:sz="6" w:space="0" w:color="808080"/>
+                          <w:left w:val="dashed" w:sz="6" w:space="0" w:color="808080"/>
+                          <w:bottom w:val="single" w:sz="12" w:space="0" w:color="000000"/>
+                          <w:right w:val="single" w:sz="12" w:space="0" w:color="000000"/>
+                        </w:tcBorders>
+                      </w:tcPr>
+                      <w:p>
+                        <w:pPr>
+                          <w:spacing w:before="0" w:after="0"/>
+                        </w:pPr>
+                        <w:r/>
+                        <w:r>
+                          <w:rPr>
+                            <w:rFonts w:ascii="宋体" w:hAnsi="宋体" w:eastAsia="宋体"/>
+                            <w:b w:val="0"/>
+                            <w:color w:val="1C1917"/>
+                            <w:sz w:val="12"/>
+                          </w:rPr>
+                          <w:t xml:space="preserve"> </w:t>
+                        </w:r>
+                      </w:p>
+                    </w:tc>
+                  </w:tr>
+                </w:tbl>
+                <w:p/>
+              </w:tc>
+              <w:tc>
+                <w:tcPr>
+                  <w:tcW w:type="dxa" w:w="397"/>
+                  <w:tcBorders/>
+                </w:tcPr>
+                <w:p>
+                  <w:pPr>
+                    <w:spacing w:before="0" w:after="0"/>
+                  </w:pPr>
+                  <w:r/>
+                </w:p>
+                <w:tbl>
+                  <w:tblPr>
+                    <w:tblW w:type="auto" w:w="0"/>
+                    <w:tblLayout w:type="fixed"/>
+                    <w:tblLook w:firstColumn="1" w:firstRow="1" w:lastColumn="0" w:lastRow="0" w:noHBand="0" w:noVBand="1" w:val="04A0"/>
+                  </w:tblPr>
+                  <w:tblGrid>
+                    <w:gridCol w:w="198"/>
+                    <w:gridCol w:w="198"/>
+                  </w:tblGrid>
+                  <w:tr>
+                    <w:trPr>
+                      <w:trHeight w:val="198" w:hRule="exact"/>
+                    </w:trPr>
+                    <w:tc>
+                      <w:tcPr>
+                        <w:tcW w:type="dxa" w:w="198"/>
+                        <w:tcBorders>
+                          <w:top w:val="single" w:sz="12" w:space="0" w:color="000000"/>
+                          <w:left w:val="single" w:sz="12" w:space="0" w:color="000000"/>
+                          <w:bottom w:val="dashed" w:sz="6" w:space="0" w:color="808080"/>
+                          <w:right w:val="dashed" w:sz="6" w:space="0" w:color="808080"/>
+                        </w:tcBorders>
+                      </w:tcPr>
+                      <w:p>
+                        <w:pPr>
+                          <w:spacing w:before="0" w:after="0"/>
+                        </w:pPr>
+                        <w:r/>
+                        <w:r>
+                          <w:rPr>
+                            <w:rFonts w:ascii="宋体" w:hAnsi="宋体" w:eastAsia="宋体"/>
+                            <w:b w:val="0"/>
+                            <w:color w:val="1C1917"/>
+                            <w:sz w:val="12"/>
+                          </w:rPr>
+                          <w:t xml:space="preserve"> </w:t>
+                        </w:r>
+                      </w:p>
+                    </w:tc>
+                    <w:tc>
+                      <w:tcPr>
+                        <w:tcW w:type="dxa" w:w="198"/>
+                        <w:tcBorders>
+                          <w:top w:val="single" w:sz="12" w:space="0" w:color="000000"/>
+                          <w:left w:val="dashed" w:sz="6" w:space="0" w:color="808080"/>
+                          <w:bottom w:val="dashed" w:sz="6" w:space="0" w:color="808080"/>
+                          <w:right w:val="single" w:sz="12" w:space="0" w:color="000000"/>
+                        </w:tcBorders>
+                      </w:tcPr>
+                      <w:p>
+                        <w:pPr>
+                          <w:spacing w:before="0" w:after="0"/>
+                        </w:pPr>
+                        <w:r/>
+                        <w:r>
+                          <w:rPr>
+                            <w:rFonts w:ascii="宋体" w:hAnsi="宋体" w:eastAsia="宋体"/>
+                            <w:b w:val="0"/>
+                            <w:color w:val="1C1917"/>
+                            <w:sz w:val="12"/>
+                          </w:rPr>
+                          <w:t xml:space="preserve"> </w:t>
+                        </w:r>
+                      </w:p>
+                    </w:tc>
+                  </w:tr>
+                  <w:tr>
+                    <w:trPr>
+                      <w:trHeight w:val="198" w:hRule="exact"/>
+                    </w:trPr>
+                    <w:tc>
+                      <w:tcPr>
+                        <w:tcW w:type="dxa" w:w="198"/>
+                        <w:tcBorders>
+                          <w:top w:val="dashed" w:sz="6" w:space="0" w:color="808080"/>
+                          <w:left w:val="single" w:sz="12" w:space="0" w:color="000000"/>
+                          <w:bottom w:val="single" w:sz="12" w:space="0" w:color="000000"/>
+                          <w:right w:val="dashed" w:sz="6" w:space="0" w:color="808080"/>
+                        </w:tcBorders>
+                      </w:tcPr>
+                      <w:p>
+                        <w:pPr>
+                          <w:spacing w:before="0" w:after="0"/>
+                        </w:pPr>
+                        <w:r/>
+                        <w:r>
+                          <w:rPr>
+                            <w:rFonts w:ascii="宋体" w:hAnsi="宋体" w:eastAsia="宋体"/>
+                            <w:b w:val="0"/>
+                            <w:color w:val="1C1917"/>
+                            <w:sz w:val="12"/>
+                          </w:rPr>
+                          <w:t xml:space="preserve"> </w:t>
+                        </w:r>
+                      </w:p>
+                    </w:tc>
+                    <w:tc>
+                      <w:tcPr>
+                        <w:tcW w:type="dxa" w:w="198"/>
+                        <w:tcBorders>
+                          <w:top w:val="dashed" w:sz="6" w:space="0" w:color="808080"/>
+                          <w:left w:val="dashed" w:sz="6" w:space="0" w:color="808080"/>
+                          <w:bottom w:val="single" w:sz="12" w:space="0" w:color="000000"/>
+                          <w:right w:val="single" w:sz="12" w:space="0" w:color="000000"/>
+                        </w:tcBorders>
+                      </w:tcPr>
+                      <w:p>
+                        <w:pPr>
+                          <w:spacing w:before="0" w:after="0"/>
+                        </w:pPr>
+                        <w:r/>
+                        <w:r>
+                          <w:rPr>
+                            <w:rFonts w:ascii="宋体" w:hAnsi="宋体" w:eastAsia="宋体"/>
+                            <w:b w:val="0"/>
+                            <w:color w:val="1C1917"/>
+                            <w:sz w:val="12"/>
+                          </w:rPr>
+                          <w:t xml:space="preserve"> </w:t>
+                        </w:r>
+                      </w:p>
+                    </w:tc>
+                  </w:tr>
+                </w:tbl>
+                <w:p/>
+              </w:tc>
+            </w:tr>
+          </w:tbl>
+          <w:p/>
+        </w:tc>
+        <w:tc>
+          <w:tcPr>
+            <w:tcW w:type="dxa" w:w="760"/>
+            <w:vAlign w:val="center"/>
+            <w:tcBorders/>
+          </w:tcPr>
+          <w:p>
+            <w:pPr>
+              <w:spacing w:before="0" w:after="0"/>
+              <w:jc w:val="left"/>
+            </w:pPr>
+            <w:r/>
+            <w:r>
+              <w:rPr>
+                <w:rFonts w:ascii="宋体" w:hAnsi="宋体" w:eastAsia="宋体"/>
+                <w:b w:val="0"/>
+                <w:color w:val="1C1917"/>
+                <w:sz w:val="21"/>
+              </w:rPr>
+              <w:t>的。</w:t>
             </w:r>
           </w:p>
         </w:tc>
@@ -362,244 +1903,12 @@
     </w:tbl>
     <w:p>
       <w:pPr>
-        <w:spacing w:before="0" w:after="60"/>
+        <w:spacing w:before="0" w:after="80"/>
       </w:pPr>
     </w:p>
     <w:p>
       <w:pPr>
-        <w:spacing w:before="0" w:after="80" w:line="276" w:lineRule="auto"/>
-      </w:pPr>
-      <w:r>
-        <w:rPr>
-          <w:rFonts w:ascii="宋体" w:hAnsi="宋体" w:eastAsia="宋体"/>
-          <w:b w:val="0"/>
-          <w:color w:val="1C1917"/>
-          <w:sz w:val="21"/>
-        </w:rPr>
-        <w:t>。</w:t>
-      </w:r>
-    </w:p>
-    <w:p>
-      <w:pPr>
-        <w:spacing w:before="0" w:after="20" w:line="276" w:lineRule="auto"/>
-      </w:pPr>
-      <w:r>
-        <w:rPr>
-          <w:rFonts w:ascii="宋体" w:hAnsi="宋体" w:eastAsia="宋体"/>
-          <w:b w:val="0"/>
-          <w:color w:val="1C1917"/>
-          <w:sz w:val="21"/>
-        </w:rPr>
-        <w:t>海上的夜是</w:t>
-      </w:r>
-    </w:p>
-    <w:p>
-      <w:pPr>
-        <w:spacing w:before="20" w:after="20" w:line="240" w:lineRule="auto"/>
-      </w:pPr>
-      <w:r>
-        <w:rPr>
-          <w:rFonts w:ascii="Times New Roman" w:hAnsi="Times New Roman" w:eastAsia="宋体"/>
-          <w:b w:val="0"/>
-          <w:color w:val="1C1917"/>
-          <w:sz w:val="20"/>
-        </w:rPr>
-        <w:t>róu hé</w:t>
-      </w:r>
-    </w:p>
-    <w:tbl>
-      <w:tblPr>
-        <w:tblW w:type="auto" w:w="0"/>
-        <w:jc w:val="left"/>
-        <w:tblLayout w:type="fixed"/>
-        <w:tblLook w:firstColumn="1" w:firstRow="1" w:lastColumn="0" w:lastRow="0" w:noHBand="0" w:noVBand="1" w:val="04A0"/>
-      </w:tblPr>
-      <w:tblGrid>
-        <w:gridCol w:w="5103"/>
-        <w:gridCol w:w="5103"/>
-      </w:tblGrid>
-      <w:tr>
-        <w:trPr>
-          <w:trHeight w:val="464" w:hRule="atLeast"/>
-        </w:trPr>
-        <w:tc>
-          <w:tcPr>
-            <w:tcW w:type="dxa" w:w="465"/>
-            <w:tcBorders>
-              <w:top w:val="single" w:sz="12" w:space="0" w:color="000000"/>
-              <w:left w:val="single" w:sz="12" w:space="0" w:color="000000"/>
-              <w:bottom w:val="single" w:sz="12" w:space="0" w:color="000000"/>
-              <w:right w:val="single" w:sz="12" w:space="0" w:color="000000"/>
-            </w:tcBorders>
-          </w:tcPr>
-          <w:p>
-            <w:pPr>
-              <w:spacing w:before="0" w:after="0"/>
-            </w:pPr>
-            <w:r/>
-            <w:r>
-              <w:rPr>
-                <w:rFonts w:ascii="宋体" w:hAnsi="宋体" w:eastAsia="宋体"/>
-                <w:b w:val="0"/>
-                <w:color w:val="1C1917"/>
-                <w:sz w:val="28"/>
-              </w:rPr>
-              <w:t xml:space="preserve">　</w:t>
-            </w:r>
-          </w:p>
-        </w:tc>
-        <w:tc>
-          <w:tcPr>
-            <w:tcW w:type="dxa" w:w="465"/>
-            <w:tcBorders>
-              <w:top w:val="single" w:sz="12" w:space="0" w:color="000000"/>
-              <w:left w:val="single" w:sz="12" w:space="0" w:color="000000"/>
-              <w:bottom w:val="single" w:sz="12" w:space="0" w:color="000000"/>
-              <w:right w:val="single" w:sz="12" w:space="0" w:color="000000"/>
-            </w:tcBorders>
-          </w:tcPr>
-          <w:p>
-            <w:pPr>
-              <w:spacing w:before="0" w:after="0"/>
-            </w:pPr>
-            <w:r/>
-            <w:r>
-              <w:rPr>
-                <w:rFonts w:ascii="宋体" w:hAnsi="宋体" w:eastAsia="宋体"/>
-                <w:b w:val="0"/>
-                <w:color w:val="1C1917"/>
-                <w:sz w:val="28"/>
-              </w:rPr>
-              <w:t xml:space="preserve">　</w:t>
-            </w:r>
-          </w:p>
-        </w:tc>
-      </w:tr>
-    </w:tbl>
-    <w:p>
-      <w:pPr>
-        <w:spacing w:before="0" w:after="60"/>
-      </w:pPr>
-    </w:p>
-    <w:p>
-      <w:pPr>
-        <w:spacing w:before="0" w:after="20" w:line="276" w:lineRule="auto"/>
-      </w:pPr>
-      <w:r>
-        <w:rPr>
-          <w:rFonts w:ascii="宋体" w:hAnsi="宋体" w:eastAsia="宋体"/>
-          <w:b w:val="0"/>
-          <w:color w:val="1C1917"/>
-          <w:sz w:val="21"/>
-        </w:rPr>
-        <w:t>的，是静寂的，是</w:t>
-      </w:r>
-    </w:p>
-    <w:p>
-      <w:pPr>
-        <w:spacing w:before="20" w:after="20" w:line="240" w:lineRule="auto"/>
-      </w:pPr>
-      <w:r>
-        <w:rPr>
-          <w:rFonts w:ascii="Times New Roman" w:hAnsi="Times New Roman" w:eastAsia="宋体"/>
-          <w:b w:val="0"/>
-          <w:color w:val="1C1917"/>
-          <w:sz w:val="20"/>
-        </w:rPr>
-        <w:t>mèng huàn</w:t>
-      </w:r>
-    </w:p>
-    <w:tbl>
-      <w:tblPr>
-        <w:tblW w:type="auto" w:w="0"/>
-        <w:jc w:val="left"/>
-        <w:tblLayout w:type="fixed"/>
-        <w:tblLook w:firstColumn="1" w:firstRow="1" w:lastColumn="0" w:lastRow="0" w:noHBand="0" w:noVBand="1" w:val="04A0"/>
-      </w:tblPr>
-      <w:tblGrid>
-        <w:gridCol w:w="5103"/>
-        <w:gridCol w:w="5103"/>
-      </w:tblGrid>
-      <w:tr>
-        <w:trPr>
-          <w:trHeight w:val="464" w:hRule="atLeast"/>
-        </w:trPr>
-        <w:tc>
-          <w:tcPr>
-            <w:tcW w:type="dxa" w:w="465"/>
-            <w:tcBorders>
-              <w:top w:val="single" w:sz="12" w:space="0" w:color="000000"/>
-              <w:left w:val="single" w:sz="12" w:space="0" w:color="000000"/>
-              <w:bottom w:val="single" w:sz="12" w:space="0" w:color="000000"/>
-              <w:right w:val="single" w:sz="12" w:space="0" w:color="000000"/>
-            </w:tcBorders>
-          </w:tcPr>
-          <w:p>
-            <w:pPr>
-              <w:spacing w:before="0" w:after="0"/>
-            </w:pPr>
-            <w:r/>
-            <w:r>
-              <w:rPr>
-                <w:rFonts w:ascii="宋体" w:hAnsi="宋体" w:eastAsia="宋体"/>
-                <w:b w:val="0"/>
-                <w:color w:val="1C1917"/>
-                <w:sz w:val="28"/>
-              </w:rPr>
-              <w:t xml:space="preserve">　</w:t>
-            </w:r>
-          </w:p>
-        </w:tc>
-        <w:tc>
-          <w:tcPr>
-            <w:tcW w:type="dxa" w:w="465"/>
-            <w:tcBorders>
-              <w:top w:val="single" w:sz="12" w:space="0" w:color="000000"/>
-              <w:left w:val="single" w:sz="12" w:space="0" w:color="000000"/>
-              <w:bottom w:val="single" w:sz="12" w:space="0" w:color="000000"/>
-              <w:right w:val="single" w:sz="12" w:space="0" w:color="000000"/>
-            </w:tcBorders>
-          </w:tcPr>
-          <w:p>
-            <w:pPr>
-              <w:spacing w:before="0" w:after="0"/>
-            </w:pPr>
-            <w:r/>
-            <w:r>
-              <w:rPr>
-                <w:rFonts w:ascii="宋体" w:hAnsi="宋体" w:eastAsia="宋体"/>
-                <w:b w:val="0"/>
-                <w:color w:val="1C1917"/>
-                <w:sz w:val="28"/>
-              </w:rPr>
-              <w:t xml:space="preserve">　</w:t>
-            </w:r>
-          </w:p>
-        </w:tc>
-      </w:tr>
-    </w:tbl>
-    <w:p>
-      <w:pPr>
-        <w:spacing w:before="0" w:after="60"/>
-      </w:pPr>
-    </w:p>
-    <w:p>
-      <w:pPr>
-        <w:spacing w:before="0" w:after="80" w:line="276" w:lineRule="auto"/>
-      </w:pPr>
-      <w:r>
-        <w:rPr>
-          <w:rFonts w:ascii="宋体" w:hAnsi="宋体" w:eastAsia="宋体"/>
-          <w:b w:val="0"/>
-          <w:color w:val="1C1917"/>
-          <w:sz w:val="21"/>
-        </w:rPr>
-        <w:t>的。</w:t>
-      </w:r>
-    </w:p>
-    <w:p>
-      <w:pPr>
-        <w:spacing w:before="140" w:after="80" w:line="276" w:lineRule="auto"/>
+        <w:spacing w:before="160" w:after="80" w:line="276" w:lineRule="auto"/>
       </w:pPr>
       <w:r>
         <w:rPr>
@@ -613,7 +1922,7 @@
     </w:p>
     <w:p>
       <w:pPr>
-        <w:spacing w:before="0" w:after="60" w:line="276" w:lineRule="auto"/>
+        <w:spacing w:before="0" w:after="40" w:line="276" w:lineRule="auto"/>
       </w:pPr>
       <w:r>
         <w:rPr>
@@ -627,7 +1936,7 @@
     </w:p>
     <w:p>
       <w:pPr>
-        <w:spacing w:before="0" w:after="60" w:line="276" w:lineRule="auto"/>
+        <w:spacing w:before="0" w:after="40" w:line="276" w:lineRule="auto"/>
       </w:pPr>
       <w:r>
         <w:rPr>
@@ -641,7 +1950,7 @@
     </w:p>
     <w:p>
       <w:pPr>
-        <w:spacing w:before="0" w:after="60" w:line="276" w:lineRule="auto"/>
+        <w:spacing w:before="0" w:after="40" w:line="276" w:lineRule="auto"/>
       </w:pPr>
       <w:r>
         <w:rPr>
@@ -655,7 +1964,7 @@
     </w:p>
     <w:p>
       <w:pPr>
-        <w:spacing w:before="140" w:after="80" w:line="276" w:lineRule="auto"/>
+        <w:spacing w:before="160" w:after="80" w:line="276" w:lineRule="auto"/>
       </w:pPr>
       <w:r>
         <w:rPr>
@@ -669,7 +1978,7 @@
     </w:p>
     <w:p>
       <w:pPr>
-        <w:spacing w:before="0" w:after="60" w:line="276" w:lineRule="auto"/>
+        <w:spacing w:before="0" w:after="40" w:line="276" w:lineRule="auto"/>
       </w:pPr>
       <w:r>
         <w:rPr>
@@ -683,7 +1992,7 @@
     </w:p>
     <w:p>
       <w:pPr>
-        <w:spacing w:before="0" w:after="60" w:line="276" w:lineRule="auto"/>
+        <w:spacing w:before="0" w:after="40" w:line="276" w:lineRule="auto"/>
       </w:pPr>
       <w:r>
         <w:rPr>
@@ -697,7 +2006,7 @@
     </w:p>
     <w:p>
       <w:pPr>
-        <w:spacing w:before="0" w:after="60" w:line="276" w:lineRule="auto"/>
+        <w:spacing w:before="0" w:after="40" w:line="276" w:lineRule="auto"/>
       </w:pPr>
       <w:r>
         <w:rPr>
@@ -711,7 +2020,7 @@
     </w:p>
     <w:p>
       <w:pPr>
-        <w:spacing w:before="140" w:after="80" w:line="276" w:lineRule="auto"/>
+        <w:spacing w:before="160" w:after="80" w:line="276" w:lineRule="auto"/>
       </w:pPr>
       <w:r>
         <w:rPr>
@@ -725,7 +2034,7 @@
     </w:p>
     <w:p>
       <w:pPr>
-        <w:spacing w:before="0" w:after="60" w:line="276" w:lineRule="auto"/>
+        <w:spacing w:before="0" w:after="40" w:line="276" w:lineRule="auto"/>
       </w:pPr>
       <w:r>
         <w:rPr>
@@ -759,7 +2068,7 @@
     </w:p>
     <w:p>
       <w:pPr>
-        <w:spacing w:before="140" w:after="80" w:line="276" w:lineRule="auto"/>
+        <w:spacing w:before="160" w:after="80" w:line="276" w:lineRule="auto"/>
       </w:pPr>
       <w:r>
         <w:rPr>
@@ -773,7 +2082,7 @@
     </w:p>
     <w:p>
       <w:pPr>
-        <w:spacing w:before="0" w:after="60" w:line="276" w:lineRule="auto"/>
+        <w:spacing w:before="0" w:after="40" w:line="276" w:lineRule="auto"/>
       </w:pPr>
       <w:r>
         <w:rPr>
@@ -787,7 +2096,7 @@
     </w:p>
     <w:p>
       <w:pPr>
-        <w:spacing w:before="0" w:after="60" w:line="276" w:lineRule="auto"/>
+        <w:spacing w:before="0" w:after="40" w:line="276" w:lineRule="auto"/>
       </w:pPr>
       <w:r>
         <w:rPr>
@@ -801,7 +2110,7 @@
     </w:p>
     <w:p>
       <w:pPr>
-        <w:spacing w:before="0" w:after="60" w:line="276" w:lineRule="auto"/>
+        <w:spacing w:before="0" w:after="40" w:line="276" w:lineRule="auto"/>
       </w:pPr>
       <w:r>
         <w:rPr>
@@ -815,7 +2124,7 @@
     </w:p>
     <w:p>
       <w:pPr>
-        <w:spacing w:before="0" w:after="60" w:line="276" w:lineRule="auto"/>
+        <w:spacing w:before="0" w:after="40" w:line="276" w:lineRule="auto"/>
       </w:pPr>
       <w:r>
         <w:rPr>
@@ -857,7 +2166,7 @@
     </w:p>
     <w:p>
       <w:pPr>
-        <w:spacing w:before="140" w:after="80" w:line="276" w:lineRule="auto"/>
+        <w:spacing w:before="160" w:after="80" w:line="276" w:lineRule="auto"/>
       </w:pPr>
       <w:r>
         <w:rPr>
@@ -871,7 +2180,7 @@
     </w:p>
     <w:p>
       <w:pPr>
-        <w:spacing w:before="0" w:after="60" w:line="276" w:lineRule="auto"/>
+        <w:spacing w:before="0" w:after="40" w:line="276" w:lineRule="auto"/>
       </w:pPr>
       <w:r>
         <w:rPr>
@@ -894,7 +2203,102 @@
           <w:color w:val="1C1917"/>
           <w:sz w:val="21"/>
         </w:rPr>
-        <w:t>加点词语：霎时　顿时　忽然　过了一会儿　一会儿工夫</w:t>
+        <w:t>加点词语：</w:t>
+      </w:r>
+      <w:r>
+        <w:rPr>
+          <w:rFonts w:ascii="宋体" w:hAnsi="宋体" w:eastAsia="宋体"/>
+          <w:b w:val="0"/>
+          <w:color w:val="1C1917"/>
+          <w:sz w:val="21"/>
+          <w:em w:val="dot"/>
+        </w:rPr>
+        <w:t>霎时</w:t>
+      </w:r>
+      <w:r>
+        <w:rPr>
+          <w:rFonts w:ascii="宋体" w:hAnsi="宋体" w:eastAsia="宋体"/>
+          <w:b w:val="0"/>
+          <w:color w:val="1C1917"/>
+          <w:sz w:val="21"/>
+        </w:rPr>
+        <w:t xml:space="preserve">　</w:t>
+      </w:r>
+      <w:r>
+        <w:rPr>
+          <w:rFonts w:ascii="宋体" w:hAnsi="宋体" w:eastAsia="宋体"/>
+          <w:b w:val="0"/>
+          <w:color w:val="1C1917"/>
+          <w:sz w:val="21"/>
+          <w:em w:val="dot"/>
+        </w:rPr>
+        <w:t>顿时</w:t>
+      </w:r>
+      <w:r>
+        <w:rPr>
+          <w:rFonts w:ascii="宋体" w:hAnsi="宋体" w:eastAsia="宋体"/>
+          <w:b w:val="0"/>
+          <w:color w:val="1C1917"/>
+          <w:sz w:val="21"/>
+        </w:rPr>
+        <w:t xml:space="preserve">　</w:t>
+      </w:r>
+      <w:r>
+        <w:rPr>
+          <w:rFonts w:ascii="宋体" w:hAnsi="宋体" w:eastAsia="宋体"/>
+          <w:b w:val="0"/>
+          <w:color w:val="1C1917"/>
+          <w:sz w:val="21"/>
+          <w:em w:val="dot"/>
+        </w:rPr>
+        <w:t>忽然</w:t>
+      </w:r>
+      <w:r>
+        <w:rPr>
+          <w:rFonts w:ascii="宋体" w:hAnsi="宋体" w:eastAsia="宋体"/>
+          <w:b w:val="0"/>
+          <w:color w:val="1C1917"/>
+          <w:sz w:val="21"/>
+        </w:rPr>
+        <w:t xml:space="preserve">　</w:t>
+      </w:r>
+      <w:r>
+        <w:rPr>
+          <w:rFonts w:ascii="宋体" w:hAnsi="宋体" w:eastAsia="宋体"/>
+          <w:b w:val="0"/>
+          <w:color w:val="1C1917"/>
+          <w:sz w:val="21"/>
+          <w:em w:val="dot"/>
+        </w:rPr>
+        <w:t>过了一会儿</w:t>
+      </w:r>
+      <w:r>
+        <w:rPr>
+          <w:rFonts w:ascii="宋体" w:hAnsi="宋体" w:eastAsia="宋体"/>
+          <w:b w:val="0"/>
+          <w:color w:val="1C1917"/>
+          <w:sz w:val="21"/>
+        </w:rPr>
+        <w:t xml:space="preserve">　</w:t>
+      </w:r>
+      <w:r>
+        <w:rPr>
+          <w:rFonts w:ascii="宋体" w:hAnsi="宋体" w:eastAsia="宋体"/>
+          <w:b w:val="0"/>
+          <w:color w:val="1C1917"/>
+          <w:sz w:val="21"/>
+          <w:em w:val="dot"/>
+        </w:rPr>
+        <w:t>一会儿工夫</w:t>
+      </w:r>
+      <w:r>
+        <w:rPr>
+          <w:rFonts w:ascii="宋体" w:hAnsi="宋体" w:eastAsia="宋体"/>
+          <w:b w:val="0"/>
+          <w:color w:val="1C1917"/>
+          <w:sz w:val="21"/>
+        </w:rPr>
+        <w:t xml:space="preserve">　</w:t>
       </w:r>
     </w:p>
     <w:p>
@@ -927,7 +2331,7 @@
     </w:p>
     <w:p>
       <w:pPr>
-        <w:spacing w:before="140" w:after="80" w:line="276" w:lineRule="auto"/>
+        <w:spacing w:before="160" w:after="80" w:line="276" w:lineRule="auto"/>
       </w:pPr>
       <w:r>
         <w:rPr>
@@ -941,7 +2345,7 @@
     </w:p>
     <w:p>
       <w:pPr>
-        <w:spacing w:before="0" w:after="60" w:line="276" w:lineRule="auto"/>
+        <w:spacing w:before="0" w:after="40" w:line="276" w:lineRule="auto"/>
       </w:pPr>
       <w:r>
         <w:rPr>
@@ -955,7 +2359,7 @@
     </w:p>
     <w:p>
       <w:pPr>
-        <w:spacing w:before="0" w:after="60" w:line="276" w:lineRule="auto"/>
+        <w:spacing w:before="0" w:after="40" w:line="276" w:lineRule="auto"/>
       </w:pPr>
       <w:r>
         <w:rPr>
@@ -969,7 +2373,7 @@
     </w:p>
     <w:p>
       <w:pPr>
-        <w:spacing w:before="0" w:after="60" w:line="276" w:lineRule="auto"/>
+        <w:spacing w:before="0" w:after="40" w:line="276" w:lineRule="auto"/>
       </w:pPr>
       <w:r>
         <w:rPr>
@@ -983,7 +2387,7 @@
     </w:p>
     <w:p>
       <w:pPr>
-        <w:spacing w:before="140" w:after="80" w:line="276" w:lineRule="auto"/>
+        <w:spacing w:before="160" w:after="80" w:line="276" w:lineRule="auto"/>
       </w:pPr>
       <w:r>
         <w:rPr>
@@ -997,7 +2401,7 @@
     </w:p>
     <w:p>
       <w:pPr>
-        <w:spacing w:before="0" w:after="60" w:line="276" w:lineRule="auto"/>
+        <w:spacing w:before="0" w:after="40" w:line="276" w:lineRule="auto"/>
       </w:pPr>
       <w:r>
         <w:rPr>
@@ -1255,7 +2659,7 @@
     </w:p>
     <w:p>
       <w:pPr>
-        <w:spacing w:before="0" w:after="60" w:line="276" w:lineRule="auto"/>
+        <w:spacing w:before="0" w:after="40" w:line="276" w:lineRule="auto"/>
       </w:pPr>
       <w:r>
         <w:rPr>
@@ -1269,7 +2673,7 @@
     </w:p>
     <w:p>
       <w:pPr>
-        <w:spacing w:before="0" w:after="60" w:line="276" w:lineRule="auto"/>
+        <w:spacing w:before="0" w:after="40" w:line="276" w:lineRule="auto"/>
       </w:pPr>
       <w:r>
         <w:rPr>
@@ -1283,7 +2687,7 @@
     </w:p>
     <w:p>
       <w:pPr>
-        <w:spacing w:before="0" w:after="60" w:line="276" w:lineRule="auto"/>
+        <w:spacing w:before="0" w:after="40" w:line="276" w:lineRule="auto"/>
       </w:pPr>
       <w:r>
         <w:rPr>
@@ -1297,7 +2701,7 @@
     </w:p>
     <w:p>
       <w:pPr>
-        <w:spacing w:before="0" w:after="60" w:line="276" w:lineRule="auto"/>
+        <w:spacing w:before="0" w:after="40" w:line="276" w:lineRule="auto"/>
       </w:pPr>
       <w:r>
         <w:rPr>
@@ -1311,7 +2715,7 @@
     </w:p>
     <w:p>
       <w:pPr>
-        <w:spacing w:before="120" w:after="60" w:line="276" w:lineRule="auto"/>
+        <w:spacing w:before="120" w:after="40" w:line="276" w:lineRule="auto"/>
       </w:pPr>
       <w:r>
         <w:rPr>
@@ -1448,7 +2852,7 @@
     </w:p>
     <w:p>
       <w:pPr>
-        <w:spacing w:before="0" w:after="60" w:line="276" w:lineRule="auto"/>
+        <w:spacing w:before="0" w:after="40" w:line="276" w:lineRule="auto"/>
       </w:pPr>
       <w:r>
         <w:rPr>
@@ -1462,7 +2866,7 @@
     </w:p>
     <w:p>
       <w:pPr>
-        <w:spacing w:before="0" w:after="60" w:line="276" w:lineRule="auto"/>
+        <w:spacing w:before="0" w:after="40" w:line="276" w:lineRule="auto"/>
       </w:pPr>
       <w:r>
         <w:rPr>
@@ -1476,7 +2880,7 @@
     </w:p>
     <w:p>
       <w:pPr>
-        <w:spacing w:before="0" w:after="60" w:line="276" w:lineRule="auto"/>
+        <w:spacing w:before="0" w:after="40" w:line="276" w:lineRule="auto"/>
       </w:pPr>
       <w:r>
         <w:rPr>
@@ -1490,7 +2894,7 @@
     </w:p>
     <w:p>
       <w:pPr>
-        <w:spacing w:before="0" w:after="60" w:line="276" w:lineRule="auto"/>
+        <w:spacing w:before="0" w:after="40" w:line="276" w:lineRule="auto"/>
       </w:pPr>
       <w:r>
         <w:rPr>
@@ -1504,7 +2908,7 @@
     </w:p>
     <w:p>
       <w:pPr>
-        <w:spacing w:before="0" w:after="60" w:line="276" w:lineRule="auto"/>
+        <w:spacing w:before="0" w:after="40" w:line="276" w:lineRule="auto"/>
       </w:pPr>
       <w:r>
         <w:rPr>
@@ -1518,7 +2922,7 @@
     </w:p>
     <w:p>
       <w:pPr>
-        <w:spacing w:before="0" w:after="60" w:line="276" w:lineRule="auto"/>
+        <w:spacing w:before="0" w:after="40" w:line="276" w:lineRule="auto"/>
       </w:pPr>
       <w:r>
         <w:rPr>
@@ -1532,7 +2936,7 @@
     </w:p>
     <w:p>
       <w:pPr>
-        <w:spacing w:before="140" w:after="80" w:line="276" w:lineRule="auto"/>
+        <w:spacing w:before="160" w:after="80" w:line="276" w:lineRule="auto"/>
       </w:pPr>
       <w:r>
         <w:rPr>
@@ -1546,7 +2950,7 @@
     </w:p>
     <w:p>
       <w:pPr>
-        <w:spacing w:before="0" w:after="60" w:line="276" w:lineRule="auto"/>
+        <w:spacing w:before="0" w:after="40" w:line="276" w:lineRule="auto"/>
       </w:pPr>
       <w:r>
         <w:rPr>
@@ -1560,7 +2964,7 @@
     </w:p>
     <w:p>
       <w:pPr>
-        <w:spacing w:before="0" w:after="60" w:line="276" w:lineRule="auto"/>
+        <w:spacing w:before="0" w:after="40" w:line="276" w:lineRule="auto"/>
       </w:pPr>
       <w:r>
         <w:rPr>
@@ -1715,7 +3119,7 @@
     </w:p>
     <w:sectPr>
       <w:pgSz w:w="11906" w:h="16838"/>
-      <w:pgMar w:top="680" w:right="850" w:bottom="680" w:left="850" w:header="720" w:footer="720" w:gutter="0"/>
+      <w:pgMar w:top="737" w:right="964" w:bottom="737" w:left="964" w:header="720" w:footer="720" w:gutter="0"/>
       <w:cols w:space="720"/>
       <w:docGrid w:linePitch="360"/>
     </w:sectPr>

</xml_diff>

<commit_message>
Fix 田字格: embed PNG grids so Word→PDF keeps visible boxes.
</commit_message>
<xml_diff>
--- a/printables/full/u01-full.docx
+++ b/printables/full/u01-full.docx
@@ -67,7 +67,7 @@
       </w:tblGrid>
       <w:tr>
         <w:trPr>
-          <w:trHeight w:val="612" w:hRule="atLeast"/>
+          <w:trHeight w:val="708" w:hRule="atLeast"/>
         </w:trPr>
         <w:tc>
           <w:tcPr>
@@ -94,13 +94,13 @@
         </w:tc>
         <w:tc>
           <w:tcPr>
-            <w:tcW w:type="dxa" w:w="907"/>
+            <w:tcW w:type="dxa" w:w="1049"/>
             <w:vAlign w:val="center"/>
             <w:tcBorders/>
           </w:tcPr>
           <w:p>
             <w:pPr>
-              <w:spacing w:before="0" w:after="0"/>
+              <w:spacing w:before="0" w:after="20"/>
               <w:jc w:val="center"/>
             </w:pPr>
             <w:r/>
@@ -117,292 +117,119 @@
           <w:tbl>
             <w:tblPr>
               <w:tblW w:type="auto" w:w="0"/>
+              <w:jc w:val="center"/>
               <w:tblLayout w:type="fixed"/>
               <w:tblLook w:firstColumn="1" w:firstRow="1" w:lastColumn="0" w:lastRow="0" w:noHBand="0" w:noVBand="1" w:val="04A0"/>
+              <w:tblBorders>
+                <w:top w:val="nil"/>
+                <w:left w:val="nil"/>
+                <w:bottom w:val="nil"/>
+                <w:right w:val="nil"/>
+                <w:insideH w:val="nil"/>
+                <w:insideV w:val="nil"/>
+              </w:tblBorders>
             </w:tblPr>
             <w:tblGrid>
-              <w:gridCol w:w="453"/>
-              <w:gridCol w:w="453"/>
+              <w:gridCol w:w="524"/>
+              <w:gridCol w:w="524"/>
             </w:tblGrid>
             <w:tr>
               <w:trPr>
-                <w:trHeight w:val="396" w:hRule="exact"/>
+                <w:trHeight w:val="442" w:hRule="atLeast"/>
               </w:trPr>
               <w:tc>
                 <w:tcPr>
-                  <w:tcW w:type="dxa" w:w="397"/>
+                  <w:tcW w:type="dxa" w:w="425"/>
                   <w:tcBorders/>
                 </w:tcPr>
                 <w:p>
                   <w:pPr>
-                    <w:spacing w:before="0" w:after="0"/>
+                    <w:spacing w:before="0" w:after="0" w:line="240" w:lineRule="auto"/>
+                    <w:jc w:val="center"/>
                   </w:pPr>
                   <w:r/>
+                  <w:r>
+                    <w:drawing>
+                      <wp:inline xmlns:a="http://schemas.openxmlformats.org/drawingml/2006/main" xmlns:pic="http://schemas.openxmlformats.org/drawingml/2006/picture">
+                        <wp:extent cx="251999" cy="251999"/>
+                        <wp:docPr id="1" name="Picture 1"/>
+                        <wp:cNvGraphicFramePr>
+                          <a:graphicFrameLocks noChangeAspect="1"/>
+                        </wp:cNvGraphicFramePr>
+                        <a:graphic>
+                          <a:graphicData uri="http://schemas.openxmlformats.org/drawingml/2006/picture">
+                            <pic:pic>
+                              <pic:nvPicPr>
+                                <pic:cNvPr id="0" name="tianzige-140.png"/>
+                                <pic:cNvPicPr/>
+                              </pic:nvPicPr>
+                              <pic:blipFill>
+                                <a:blip r:embed="rId9"/>
+                                <a:stretch>
+                                  <a:fillRect/>
+                                </a:stretch>
+                              </pic:blipFill>
+                              <pic:spPr>
+                                <a:xfrm>
+                                  <a:off x="0" y="0"/>
+                                  <a:ext cx="251999" cy="251999"/>
+                                </a:xfrm>
+                                <a:prstGeom prst="rect"/>
+                              </pic:spPr>
+                            </pic:pic>
+                          </a:graphicData>
+                        </a:graphic>
+                      </wp:inline>
+                    </w:drawing>
+                  </w:r>
                 </w:p>
-                <w:tbl>
-                  <w:tblPr>
-                    <w:tblW w:type="auto" w:w="0"/>
-                    <w:tblLayout w:type="fixed"/>
-                    <w:tblLook w:firstColumn="1" w:firstRow="1" w:lastColumn="0" w:lastRow="0" w:noHBand="0" w:noVBand="1" w:val="04A0"/>
-                  </w:tblPr>
-                  <w:tblGrid>
-                    <w:gridCol w:w="198"/>
-                    <w:gridCol w:w="198"/>
-                  </w:tblGrid>
-                  <w:tr>
-                    <w:trPr>
-                      <w:trHeight w:val="198" w:hRule="exact"/>
-                    </w:trPr>
-                    <w:tc>
-                      <w:tcPr>
-                        <w:tcW w:type="dxa" w:w="198"/>
-                        <w:tcBorders>
-                          <w:top w:val="single" w:sz="12" w:space="0" w:color="000000"/>
-                          <w:left w:val="single" w:sz="12" w:space="0" w:color="000000"/>
-                          <w:bottom w:val="dashed" w:sz="6" w:space="0" w:color="808080"/>
-                          <w:right w:val="dashed" w:sz="6" w:space="0" w:color="808080"/>
-                        </w:tcBorders>
-                      </w:tcPr>
-                      <w:p>
-                        <w:pPr>
-                          <w:spacing w:before="0" w:after="0"/>
-                        </w:pPr>
-                        <w:r/>
-                        <w:r>
-                          <w:rPr>
-                            <w:rFonts w:ascii="宋体" w:hAnsi="宋体" w:eastAsia="宋体"/>
-                            <w:b w:val="0"/>
-                            <w:color w:val="1C1917"/>
-                            <w:sz w:val="12"/>
-                          </w:rPr>
-                          <w:t xml:space="preserve"> </w:t>
-                        </w:r>
-                      </w:p>
-                    </w:tc>
-                    <w:tc>
-                      <w:tcPr>
-                        <w:tcW w:type="dxa" w:w="198"/>
-                        <w:tcBorders>
-                          <w:top w:val="single" w:sz="12" w:space="0" w:color="000000"/>
-                          <w:left w:val="dashed" w:sz="6" w:space="0" w:color="808080"/>
-                          <w:bottom w:val="dashed" w:sz="6" w:space="0" w:color="808080"/>
-                          <w:right w:val="single" w:sz="12" w:space="0" w:color="000000"/>
-                        </w:tcBorders>
-                      </w:tcPr>
-                      <w:p>
-                        <w:pPr>
-                          <w:spacing w:before="0" w:after="0"/>
-                        </w:pPr>
-                        <w:r/>
-                        <w:r>
-                          <w:rPr>
-                            <w:rFonts w:ascii="宋体" w:hAnsi="宋体" w:eastAsia="宋体"/>
-                            <w:b w:val="0"/>
-                            <w:color w:val="1C1917"/>
-                            <w:sz w:val="12"/>
-                          </w:rPr>
-                          <w:t xml:space="preserve"> </w:t>
-                        </w:r>
-                      </w:p>
-                    </w:tc>
-                  </w:tr>
-                  <w:tr>
-                    <w:trPr>
-                      <w:trHeight w:val="198" w:hRule="exact"/>
-                    </w:trPr>
-                    <w:tc>
-                      <w:tcPr>
-                        <w:tcW w:type="dxa" w:w="198"/>
-                        <w:tcBorders>
-                          <w:top w:val="dashed" w:sz="6" w:space="0" w:color="808080"/>
-                          <w:left w:val="single" w:sz="12" w:space="0" w:color="000000"/>
-                          <w:bottom w:val="single" w:sz="12" w:space="0" w:color="000000"/>
-                          <w:right w:val="dashed" w:sz="6" w:space="0" w:color="808080"/>
-                        </w:tcBorders>
-                      </w:tcPr>
-                      <w:p>
-                        <w:pPr>
-                          <w:spacing w:before="0" w:after="0"/>
-                        </w:pPr>
-                        <w:r/>
-                        <w:r>
-                          <w:rPr>
-                            <w:rFonts w:ascii="宋体" w:hAnsi="宋体" w:eastAsia="宋体"/>
-                            <w:b w:val="0"/>
-                            <w:color w:val="1C1917"/>
-                            <w:sz w:val="12"/>
-                          </w:rPr>
-                          <w:t xml:space="preserve"> </w:t>
-                        </w:r>
-                      </w:p>
-                    </w:tc>
-                    <w:tc>
-                      <w:tcPr>
-                        <w:tcW w:type="dxa" w:w="198"/>
-                        <w:tcBorders>
-                          <w:top w:val="dashed" w:sz="6" w:space="0" w:color="808080"/>
-                          <w:left w:val="dashed" w:sz="6" w:space="0" w:color="808080"/>
-                          <w:bottom w:val="single" w:sz="12" w:space="0" w:color="000000"/>
-                          <w:right w:val="single" w:sz="12" w:space="0" w:color="000000"/>
-                        </w:tcBorders>
-                      </w:tcPr>
-                      <w:p>
-                        <w:pPr>
-                          <w:spacing w:before="0" w:after="0"/>
-                        </w:pPr>
-                        <w:r/>
-                        <w:r>
-                          <w:rPr>
-                            <w:rFonts w:ascii="宋体" w:hAnsi="宋体" w:eastAsia="宋体"/>
-                            <w:b w:val="0"/>
-                            <w:color w:val="1C1917"/>
-                            <w:sz w:val="12"/>
-                          </w:rPr>
-                          <w:t xml:space="preserve"> </w:t>
-                        </w:r>
-                      </w:p>
-                    </w:tc>
-                  </w:tr>
-                </w:tbl>
-                <w:p/>
               </w:tc>
               <w:tc>
                 <w:tcPr>
-                  <w:tcW w:type="dxa" w:w="397"/>
+                  <w:tcW w:type="dxa" w:w="425"/>
                   <w:tcBorders/>
                 </w:tcPr>
                 <w:p>
                   <w:pPr>
-                    <w:spacing w:before="0" w:after="0"/>
+                    <w:spacing w:before="0" w:after="0" w:line="240" w:lineRule="auto"/>
+                    <w:jc w:val="center"/>
                   </w:pPr>
                   <w:r/>
+                  <w:r>
+                    <w:drawing>
+                      <wp:inline xmlns:a="http://schemas.openxmlformats.org/drawingml/2006/main" xmlns:pic="http://schemas.openxmlformats.org/drawingml/2006/picture">
+                        <wp:extent cx="251999" cy="251999"/>
+                        <wp:docPr id="2" name="Picture 2"/>
+                        <wp:cNvGraphicFramePr>
+                          <a:graphicFrameLocks noChangeAspect="1"/>
+                        </wp:cNvGraphicFramePr>
+                        <a:graphic>
+                          <a:graphicData uri="http://schemas.openxmlformats.org/drawingml/2006/picture">
+                            <pic:pic>
+                              <pic:nvPicPr>
+                                <pic:cNvPr id="0" name="tianzige-140.png"/>
+                                <pic:cNvPicPr/>
+                              </pic:nvPicPr>
+                              <pic:blipFill>
+                                <a:blip r:embed="rId9"/>
+                                <a:stretch>
+                                  <a:fillRect/>
+                                </a:stretch>
+                              </pic:blipFill>
+                              <pic:spPr>
+                                <a:xfrm>
+                                  <a:off x="0" y="0"/>
+                                  <a:ext cx="251999" cy="251999"/>
+                                </a:xfrm>
+                                <a:prstGeom prst="rect"/>
+                              </pic:spPr>
+                            </pic:pic>
+                          </a:graphicData>
+                        </a:graphic>
+                      </wp:inline>
+                    </w:drawing>
+                  </w:r>
                 </w:p>
-                <w:tbl>
-                  <w:tblPr>
-                    <w:tblW w:type="auto" w:w="0"/>
-                    <w:tblLayout w:type="fixed"/>
-                    <w:tblLook w:firstColumn="1" w:firstRow="1" w:lastColumn="0" w:lastRow="0" w:noHBand="0" w:noVBand="1" w:val="04A0"/>
-                  </w:tblPr>
-                  <w:tblGrid>
-                    <w:gridCol w:w="198"/>
-                    <w:gridCol w:w="198"/>
-                  </w:tblGrid>
-                  <w:tr>
-                    <w:trPr>
-                      <w:trHeight w:val="198" w:hRule="exact"/>
-                    </w:trPr>
-                    <w:tc>
-                      <w:tcPr>
-                        <w:tcW w:type="dxa" w:w="198"/>
-                        <w:tcBorders>
-                          <w:top w:val="single" w:sz="12" w:space="0" w:color="000000"/>
-                          <w:left w:val="single" w:sz="12" w:space="0" w:color="000000"/>
-                          <w:bottom w:val="dashed" w:sz="6" w:space="0" w:color="808080"/>
-                          <w:right w:val="dashed" w:sz="6" w:space="0" w:color="808080"/>
-                        </w:tcBorders>
-                      </w:tcPr>
-                      <w:p>
-                        <w:pPr>
-                          <w:spacing w:before="0" w:after="0"/>
-                        </w:pPr>
-                        <w:r/>
-                        <w:r>
-                          <w:rPr>
-                            <w:rFonts w:ascii="宋体" w:hAnsi="宋体" w:eastAsia="宋体"/>
-                            <w:b w:val="0"/>
-                            <w:color w:val="1C1917"/>
-                            <w:sz w:val="12"/>
-                          </w:rPr>
-                          <w:t xml:space="preserve"> </w:t>
-                        </w:r>
-                      </w:p>
-                    </w:tc>
-                    <w:tc>
-                      <w:tcPr>
-                        <w:tcW w:type="dxa" w:w="198"/>
-                        <w:tcBorders>
-                          <w:top w:val="single" w:sz="12" w:space="0" w:color="000000"/>
-                          <w:left w:val="dashed" w:sz="6" w:space="0" w:color="808080"/>
-                          <w:bottom w:val="dashed" w:sz="6" w:space="0" w:color="808080"/>
-                          <w:right w:val="single" w:sz="12" w:space="0" w:color="000000"/>
-                        </w:tcBorders>
-                      </w:tcPr>
-                      <w:p>
-                        <w:pPr>
-                          <w:spacing w:before="0" w:after="0"/>
-                        </w:pPr>
-                        <w:r/>
-                        <w:r>
-                          <w:rPr>
-                            <w:rFonts w:ascii="宋体" w:hAnsi="宋体" w:eastAsia="宋体"/>
-                            <w:b w:val="0"/>
-                            <w:color w:val="1C1917"/>
-                            <w:sz w:val="12"/>
-                          </w:rPr>
-                          <w:t xml:space="preserve"> </w:t>
-                        </w:r>
-                      </w:p>
-                    </w:tc>
-                  </w:tr>
-                  <w:tr>
-                    <w:trPr>
-                      <w:trHeight w:val="198" w:hRule="exact"/>
-                    </w:trPr>
-                    <w:tc>
-                      <w:tcPr>
-                        <w:tcW w:type="dxa" w:w="198"/>
-                        <w:tcBorders>
-                          <w:top w:val="dashed" w:sz="6" w:space="0" w:color="808080"/>
-                          <w:left w:val="single" w:sz="12" w:space="0" w:color="000000"/>
-                          <w:bottom w:val="single" w:sz="12" w:space="0" w:color="000000"/>
-                          <w:right w:val="dashed" w:sz="6" w:space="0" w:color="808080"/>
-                        </w:tcBorders>
-                      </w:tcPr>
-                      <w:p>
-                        <w:pPr>
-                          <w:spacing w:before="0" w:after="0"/>
-                        </w:pPr>
-                        <w:r/>
-                        <w:r>
-                          <w:rPr>
-                            <w:rFonts w:ascii="宋体" w:hAnsi="宋体" w:eastAsia="宋体"/>
-                            <w:b w:val="0"/>
-                            <w:color w:val="1C1917"/>
-                            <w:sz w:val="12"/>
-                          </w:rPr>
-                          <w:t xml:space="preserve"> </w:t>
-                        </w:r>
-                      </w:p>
-                    </w:tc>
-                    <w:tc>
-                      <w:tcPr>
-                        <w:tcW w:type="dxa" w:w="198"/>
-                        <w:tcBorders>
-                          <w:top w:val="dashed" w:sz="6" w:space="0" w:color="808080"/>
-                          <w:left w:val="dashed" w:sz="6" w:space="0" w:color="808080"/>
-                          <w:bottom w:val="single" w:sz="12" w:space="0" w:color="000000"/>
-                          <w:right w:val="single" w:sz="12" w:space="0" w:color="000000"/>
-                        </w:tcBorders>
-                      </w:tcPr>
-                      <w:p>
-                        <w:pPr>
-                          <w:spacing w:before="0" w:after="0"/>
-                        </w:pPr>
-                        <w:r/>
-                        <w:r>
-                          <w:rPr>
-                            <w:rFonts w:ascii="宋体" w:hAnsi="宋体" w:eastAsia="宋体"/>
-                            <w:b w:val="0"/>
-                            <w:color w:val="1C1917"/>
-                            <w:sz w:val="12"/>
-                          </w:rPr>
-                          <w:t xml:space="preserve"> </w:t>
-                        </w:r>
-                      </w:p>
-                    </w:tc>
-                  </w:tr>
-                </w:tbl>
-                <w:p/>
               </w:tc>
             </w:tr>
           </w:tbl>
@@ -462,7 +289,7 @@
       </w:tblGrid>
       <w:tr>
         <w:trPr>
-          <w:trHeight w:val="612" w:hRule="atLeast"/>
+          <w:trHeight w:val="708" w:hRule="atLeast"/>
         </w:trPr>
         <w:tc>
           <w:tcPr>
@@ -489,13 +316,13 @@
         </w:tc>
         <w:tc>
           <w:tcPr>
-            <w:tcW w:type="dxa" w:w="907"/>
+            <w:tcW w:type="dxa" w:w="1049"/>
             <w:vAlign w:val="center"/>
             <w:tcBorders/>
           </w:tcPr>
           <w:p>
             <w:pPr>
-              <w:spacing w:before="0" w:after="0"/>
+              <w:spacing w:before="0" w:after="20"/>
               <w:jc w:val="center"/>
             </w:pPr>
             <w:r/>
@@ -512,292 +339,119 @@
           <w:tbl>
             <w:tblPr>
               <w:tblW w:type="auto" w:w="0"/>
+              <w:jc w:val="center"/>
               <w:tblLayout w:type="fixed"/>
               <w:tblLook w:firstColumn="1" w:firstRow="1" w:lastColumn="0" w:lastRow="0" w:noHBand="0" w:noVBand="1" w:val="04A0"/>
+              <w:tblBorders>
+                <w:top w:val="nil"/>
+                <w:left w:val="nil"/>
+                <w:bottom w:val="nil"/>
+                <w:right w:val="nil"/>
+                <w:insideH w:val="nil"/>
+                <w:insideV w:val="nil"/>
+              </w:tblBorders>
             </w:tblPr>
             <w:tblGrid>
-              <w:gridCol w:w="453"/>
-              <w:gridCol w:w="453"/>
+              <w:gridCol w:w="524"/>
+              <w:gridCol w:w="524"/>
             </w:tblGrid>
             <w:tr>
               <w:trPr>
-                <w:trHeight w:val="396" w:hRule="exact"/>
+                <w:trHeight w:val="442" w:hRule="atLeast"/>
               </w:trPr>
               <w:tc>
                 <w:tcPr>
-                  <w:tcW w:type="dxa" w:w="397"/>
+                  <w:tcW w:type="dxa" w:w="425"/>
                   <w:tcBorders/>
                 </w:tcPr>
                 <w:p>
                   <w:pPr>
-                    <w:spacing w:before="0" w:after="0"/>
+                    <w:spacing w:before="0" w:after="0" w:line="240" w:lineRule="auto"/>
+                    <w:jc w:val="center"/>
                   </w:pPr>
                   <w:r/>
+                  <w:r>
+                    <w:drawing>
+                      <wp:inline xmlns:a="http://schemas.openxmlformats.org/drawingml/2006/main" xmlns:pic="http://schemas.openxmlformats.org/drawingml/2006/picture">
+                        <wp:extent cx="251999" cy="251999"/>
+                        <wp:docPr id="3" name="Picture 3"/>
+                        <wp:cNvGraphicFramePr>
+                          <a:graphicFrameLocks noChangeAspect="1"/>
+                        </wp:cNvGraphicFramePr>
+                        <a:graphic>
+                          <a:graphicData uri="http://schemas.openxmlformats.org/drawingml/2006/picture">
+                            <pic:pic>
+                              <pic:nvPicPr>
+                                <pic:cNvPr id="0" name="tianzige-140.png"/>
+                                <pic:cNvPicPr/>
+                              </pic:nvPicPr>
+                              <pic:blipFill>
+                                <a:blip r:embed="rId9"/>
+                                <a:stretch>
+                                  <a:fillRect/>
+                                </a:stretch>
+                              </pic:blipFill>
+                              <pic:spPr>
+                                <a:xfrm>
+                                  <a:off x="0" y="0"/>
+                                  <a:ext cx="251999" cy="251999"/>
+                                </a:xfrm>
+                                <a:prstGeom prst="rect"/>
+                              </pic:spPr>
+                            </pic:pic>
+                          </a:graphicData>
+                        </a:graphic>
+                      </wp:inline>
+                    </w:drawing>
+                  </w:r>
                 </w:p>
-                <w:tbl>
-                  <w:tblPr>
-                    <w:tblW w:type="auto" w:w="0"/>
-                    <w:tblLayout w:type="fixed"/>
-                    <w:tblLook w:firstColumn="1" w:firstRow="1" w:lastColumn="0" w:lastRow="0" w:noHBand="0" w:noVBand="1" w:val="04A0"/>
-                  </w:tblPr>
-                  <w:tblGrid>
-                    <w:gridCol w:w="198"/>
-                    <w:gridCol w:w="198"/>
-                  </w:tblGrid>
-                  <w:tr>
-                    <w:trPr>
-                      <w:trHeight w:val="198" w:hRule="exact"/>
-                    </w:trPr>
-                    <w:tc>
-                      <w:tcPr>
-                        <w:tcW w:type="dxa" w:w="198"/>
-                        <w:tcBorders>
-                          <w:top w:val="single" w:sz="12" w:space="0" w:color="000000"/>
-                          <w:left w:val="single" w:sz="12" w:space="0" w:color="000000"/>
-                          <w:bottom w:val="dashed" w:sz="6" w:space="0" w:color="808080"/>
-                          <w:right w:val="dashed" w:sz="6" w:space="0" w:color="808080"/>
-                        </w:tcBorders>
-                      </w:tcPr>
-                      <w:p>
-                        <w:pPr>
-                          <w:spacing w:before="0" w:after="0"/>
-                        </w:pPr>
-                        <w:r/>
-                        <w:r>
-                          <w:rPr>
-                            <w:rFonts w:ascii="宋体" w:hAnsi="宋体" w:eastAsia="宋体"/>
-                            <w:b w:val="0"/>
-                            <w:color w:val="1C1917"/>
-                            <w:sz w:val="12"/>
-                          </w:rPr>
-                          <w:t xml:space="preserve"> </w:t>
-                        </w:r>
-                      </w:p>
-                    </w:tc>
-                    <w:tc>
-                      <w:tcPr>
-                        <w:tcW w:type="dxa" w:w="198"/>
-                        <w:tcBorders>
-                          <w:top w:val="single" w:sz="12" w:space="0" w:color="000000"/>
-                          <w:left w:val="dashed" w:sz="6" w:space="0" w:color="808080"/>
-                          <w:bottom w:val="dashed" w:sz="6" w:space="0" w:color="808080"/>
-                          <w:right w:val="single" w:sz="12" w:space="0" w:color="000000"/>
-                        </w:tcBorders>
-                      </w:tcPr>
-                      <w:p>
-                        <w:pPr>
-                          <w:spacing w:before="0" w:after="0"/>
-                        </w:pPr>
-                        <w:r/>
-                        <w:r>
-                          <w:rPr>
-                            <w:rFonts w:ascii="宋体" w:hAnsi="宋体" w:eastAsia="宋体"/>
-                            <w:b w:val="0"/>
-                            <w:color w:val="1C1917"/>
-                            <w:sz w:val="12"/>
-                          </w:rPr>
-                          <w:t xml:space="preserve"> </w:t>
-                        </w:r>
-                      </w:p>
-                    </w:tc>
-                  </w:tr>
-                  <w:tr>
-                    <w:trPr>
-                      <w:trHeight w:val="198" w:hRule="exact"/>
-                    </w:trPr>
-                    <w:tc>
-                      <w:tcPr>
-                        <w:tcW w:type="dxa" w:w="198"/>
-                        <w:tcBorders>
-                          <w:top w:val="dashed" w:sz="6" w:space="0" w:color="808080"/>
-                          <w:left w:val="single" w:sz="12" w:space="0" w:color="000000"/>
-                          <w:bottom w:val="single" w:sz="12" w:space="0" w:color="000000"/>
-                          <w:right w:val="dashed" w:sz="6" w:space="0" w:color="808080"/>
-                        </w:tcBorders>
-                      </w:tcPr>
-                      <w:p>
-                        <w:pPr>
-                          <w:spacing w:before="0" w:after="0"/>
-                        </w:pPr>
-                        <w:r/>
-                        <w:r>
-                          <w:rPr>
-                            <w:rFonts w:ascii="宋体" w:hAnsi="宋体" w:eastAsia="宋体"/>
-                            <w:b w:val="0"/>
-                            <w:color w:val="1C1917"/>
-                            <w:sz w:val="12"/>
-                          </w:rPr>
-                          <w:t xml:space="preserve"> </w:t>
-                        </w:r>
-                      </w:p>
-                    </w:tc>
-                    <w:tc>
-                      <w:tcPr>
-                        <w:tcW w:type="dxa" w:w="198"/>
-                        <w:tcBorders>
-                          <w:top w:val="dashed" w:sz="6" w:space="0" w:color="808080"/>
-                          <w:left w:val="dashed" w:sz="6" w:space="0" w:color="808080"/>
-                          <w:bottom w:val="single" w:sz="12" w:space="0" w:color="000000"/>
-                          <w:right w:val="single" w:sz="12" w:space="0" w:color="000000"/>
-                        </w:tcBorders>
-                      </w:tcPr>
-                      <w:p>
-                        <w:pPr>
-                          <w:spacing w:before="0" w:after="0"/>
-                        </w:pPr>
-                        <w:r/>
-                        <w:r>
-                          <w:rPr>
-                            <w:rFonts w:ascii="宋体" w:hAnsi="宋体" w:eastAsia="宋体"/>
-                            <w:b w:val="0"/>
-                            <w:color w:val="1C1917"/>
-                            <w:sz w:val="12"/>
-                          </w:rPr>
-                          <w:t xml:space="preserve"> </w:t>
-                        </w:r>
-                      </w:p>
-                    </w:tc>
-                  </w:tr>
-                </w:tbl>
-                <w:p/>
               </w:tc>
               <w:tc>
                 <w:tcPr>
-                  <w:tcW w:type="dxa" w:w="397"/>
+                  <w:tcW w:type="dxa" w:w="425"/>
                   <w:tcBorders/>
                 </w:tcPr>
                 <w:p>
                   <w:pPr>
-                    <w:spacing w:before="0" w:after="0"/>
+                    <w:spacing w:before="0" w:after="0" w:line="240" w:lineRule="auto"/>
+                    <w:jc w:val="center"/>
                   </w:pPr>
                   <w:r/>
+                  <w:r>
+                    <w:drawing>
+                      <wp:inline xmlns:a="http://schemas.openxmlformats.org/drawingml/2006/main" xmlns:pic="http://schemas.openxmlformats.org/drawingml/2006/picture">
+                        <wp:extent cx="251999" cy="251999"/>
+                        <wp:docPr id="4" name="Picture 4"/>
+                        <wp:cNvGraphicFramePr>
+                          <a:graphicFrameLocks noChangeAspect="1"/>
+                        </wp:cNvGraphicFramePr>
+                        <a:graphic>
+                          <a:graphicData uri="http://schemas.openxmlformats.org/drawingml/2006/picture">
+                            <pic:pic>
+                              <pic:nvPicPr>
+                                <pic:cNvPr id="0" name="tianzige-140.png"/>
+                                <pic:cNvPicPr/>
+                              </pic:nvPicPr>
+                              <pic:blipFill>
+                                <a:blip r:embed="rId9"/>
+                                <a:stretch>
+                                  <a:fillRect/>
+                                </a:stretch>
+                              </pic:blipFill>
+                              <pic:spPr>
+                                <a:xfrm>
+                                  <a:off x="0" y="0"/>
+                                  <a:ext cx="251999" cy="251999"/>
+                                </a:xfrm>
+                                <a:prstGeom prst="rect"/>
+                              </pic:spPr>
+                            </pic:pic>
+                          </a:graphicData>
+                        </a:graphic>
+                      </wp:inline>
+                    </w:drawing>
+                  </w:r>
                 </w:p>
-                <w:tbl>
-                  <w:tblPr>
-                    <w:tblW w:type="auto" w:w="0"/>
-                    <w:tblLayout w:type="fixed"/>
-                    <w:tblLook w:firstColumn="1" w:firstRow="1" w:lastColumn="0" w:lastRow="0" w:noHBand="0" w:noVBand="1" w:val="04A0"/>
-                  </w:tblPr>
-                  <w:tblGrid>
-                    <w:gridCol w:w="198"/>
-                    <w:gridCol w:w="198"/>
-                  </w:tblGrid>
-                  <w:tr>
-                    <w:trPr>
-                      <w:trHeight w:val="198" w:hRule="exact"/>
-                    </w:trPr>
-                    <w:tc>
-                      <w:tcPr>
-                        <w:tcW w:type="dxa" w:w="198"/>
-                        <w:tcBorders>
-                          <w:top w:val="single" w:sz="12" w:space="0" w:color="000000"/>
-                          <w:left w:val="single" w:sz="12" w:space="0" w:color="000000"/>
-                          <w:bottom w:val="dashed" w:sz="6" w:space="0" w:color="808080"/>
-                          <w:right w:val="dashed" w:sz="6" w:space="0" w:color="808080"/>
-                        </w:tcBorders>
-                      </w:tcPr>
-                      <w:p>
-                        <w:pPr>
-                          <w:spacing w:before="0" w:after="0"/>
-                        </w:pPr>
-                        <w:r/>
-                        <w:r>
-                          <w:rPr>
-                            <w:rFonts w:ascii="宋体" w:hAnsi="宋体" w:eastAsia="宋体"/>
-                            <w:b w:val="0"/>
-                            <w:color w:val="1C1917"/>
-                            <w:sz w:val="12"/>
-                          </w:rPr>
-                          <w:t xml:space="preserve"> </w:t>
-                        </w:r>
-                      </w:p>
-                    </w:tc>
-                    <w:tc>
-                      <w:tcPr>
-                        <w:tcW w:type="dxa" w:w="198"/>
-                        <w:tcBorders>
-                          <w:top w:val="single" w:sz="12" w:space="0" w:color="000000"/>
-                          <w:left w:val="dashed" w:sz="6" w:space="0" w:color="808080"/>
-                          <w:bottom w:val="dashed" w:sz="6" w:space="0" w:color="808080"/>
-                          <w:right w:val="single" w:sz="12" w:space="0" w:color="000000"/>
-                        </w:tcBorders>
-                      </w:tcPr>
-                      <w:p>
-                        <w:pPr>
-                          <w:spacing w:before="0" w:after="0"/>
-                        </w:pPr>
-                        <w:r/>
-                        <w:r>
-                          <w:rPr>
-                            <w:rFonts w:ascii="宋体" w:hAnsi="宋体" w:eastAsia="宋体"/>
-                            <w:b w:val="0"/>
-                            <w:color w:val="1C1917"/>
-                            <w:sz w:val="12"/>
-                          </w:rPr>
-                          <w:t xml:space="preserve"> </w:t>
-                        </w:r>
-                      </w:p>
-                    </w:tc>
-                  </w:tr>
-                  <w:tr>
-                    <w:trPr>
-                      <w:trHeight w:val="198" w:hRule="exact"/>
-                    </w:trPr>
-                    <w:tc>
-                      <w:tcPr>
-                        <w:tcW w:type="dxa" w:w="198"/>
-                        <w:tcBorders>
-                          <w:top w:val="dashed" w:sz="6" w:space="0" w:color="808080"/>
-                          <w:left w:val="single" w:sz="12" w:space="0" w:color="000000"/>
-                          <w:bottom w:val="single" w:sz="12" w:space="0" w:color="000000"/>
-                          <w:right w:val="dashed" w:sz="6" w:space="0" w:color="808080"/>
-                        </w:tcBorders>
-                      </w:tcPr>
-                      <w:p>
-                        <w:pPr>
-                          <w:spacing w:before="0" w:after="0"/>
-                        </w:pPr>
-                        <w:r/>
-                        <w:r>
-                          <w:rPr>
-                            <w:rFonts w:ascii="宋体" w:hAnsi="宋体" w:eastAsia="宋体"/>
-                            <w:b w:val="0"/>
-                            <w:color w:val="1C1917"/>
-                            <w:sz w:val="12"/>
-                          </w:rPr>
-                          <w:t xml:space="preserve"> </w:t>
-                        </w:r>
-                      </w:p>
-                    </w:tc>
-                    <w:tc>
-                      <w:tcPr>
-                        <w:tcW w:type="dxa" w:w="198"/>
-                        <w:tcBorders>
-                          <w:top w:val="dashed" w:sz="6" w:space="0" w:color="808080"/>
-                          <w:left w:val="dashed" w:sz="6" w:space="0" w:color="808080"/>
-                          <w:bottom w:val="single" w:sz="12" w:space="0" w:color="000000"/>
-                          <w:right w:val="single" w:sz="12" w:space="0" w:color="000000"/>
-                        </w:tcBorders>
-                      </w:tcPr>
-                      <w:p>
-                        <w:pPr>
-                          <w:spacing w:before="0" w:after="0"/>
-                        </w:pPr>
-                        <w:r/>
-                        <w:r>
-                          <w:rPr>
-                            <w:rFonts w:ascii="宋体" w:hAnsi="宋体" w:eastAsia="宋体"/>
-                            <w:b w:val="0"/>
-                            <w:color w:val="1C1917"/>
-                            <w:sz w:val="12"/>
-                          </w:rPr>
-                          <w:t xml:space="preserve"> </w:t>
-                        </w:r>
-                      </w:p>
-                    </w:tc>
-                  </w:tr>
-                </w:tbl>
-                <w:p/>
               </w:tc>
             </w:tr>
           </w:tbl>
@@ -828,13 +482,13 @@
         </w:tc>
         <w:tc>
           <w:tcPr>
-            <w:tcW w:type="dxa" w:w="907"/>
+            <w:tcW w:type="dxa" w:w="1049"/>
             <w:vAlign w:val="center"/>
             <w:tcBorders/>
           </w:tcPr>
           <w:p>
             <w:pPr>
-              <w:spacing w:before="0" w:after="0"/>
+              <w:spacing w:before="0" w:after="20"/>
               <w:jc w:val="center"/>
             </w:pPr>
             <w:r/>
@@ -851,292 +505,119 @@
           <w:tbl>
             <w:tblPr>
               <w:tblW w:type="auto" w:w="0"/>
+              <w:jc w:val="center"/>
               <w:tblLayout w:type="fixed"/>
               <w:tblLook w:firstColumn="1" w:firstRow="1" w:lastColumn="0" w:lastRow="0" w:noHBand="0" w:noVBand="1" w:val="04A0"/>
+              <w:tblBorders>
+                <w:top w:val="nil"/>
+                <w:left w:val="nil"/>
+                <w:bottom w:val="nil"/>
+                <w:right w:val="nil"/>
+                <w:insideH w:val="nil"/>
+                <w:insideV w:val="nil"/>
+              </w:tblBorders>
             </w:tblPr>
             <w:tblGrid>
-              <w:gridCol w:w="453"/>
-              <w:gridCol w:w="453"/>
+              <w:gridCol w:w="524"/>
+              <w:gridCol w:w="524"/>
             </w:tblGrid>
             <w:tr>
               <w:trPr>
-                <w:trHeight w:val="396" w:hRule="exact"/>
+                <w:trHeight w:val="442" w:hRule="atLeast"/>
               </w:trPr>
               <w:tc>
                 <w:tcPr>
-                  <w:tcW w:type="dxa" w:w="397"/>
+                  <w:tcW w:type="dxa" w:w="425"/>
                   <w:tcBorders/>
                 </w:tcPr>
                 <w:p>
                   <w:pPr>
-                    <w:spacing w:before="0" w:after="0"/>
+                    <w:spacing w:before="0" w:after="0" w:line="240" w:lineRule="auto"/>
+                    <w:jc w:val="center"/>
                   </w:pPr>
                   <w:r/>
+                  <w:r>
+                    <w:drawing>
+                      <wp:inline xmlns:a="http://schemas.openxmlformats.org/drawingml/2006/main" xmlns:pic="http://schemas.openxmlformats.org/drawingml/2006/picture">
+                        <wp:extent cx="251999" cy="251999"/>
+                        <wp:docPr id="5" name="Picture 5"/>
+                        <wp:cNvGraphicFramePr>
+                          <a:graphicFrameLocks noChangeAspect="1"/>
+                        </wp:cNvGraphicFramePr>
+                        <a:graphic>
+                          <a:graphicData uri="http://schemas.openxmlformats.org/drawingml/2006/picture">
+                            <pic:pic>
+                              <pic:nvPicPr>
+                                <pic:cNvPr id="0" name="tianzige-140.png"/>
+                                <pic:cNvPicPr/>
+                              </pic:nvPicPr>
+                              <pic:blipFill>
+                                <a:blip r:embed="rId9"/>
+                                <a:stretch>
+                                  <a:fillRect/>
+                                </a:stretch>
+                              </pic:blipFill>
+                              <pic:spPr>
+                                <a:xfrm>
+                                  <a:off x="0" y="0"/>
+                                  <a:ext cx="251999" cy="251999"/>
+                                </a:xfrm>
+                                <a:prstGeom prst="rect"/>
+                              </pic:spPr>
+                            </pic:pic>
+                          </a:graphicData>
+                        </a:graphic>
+                      </wp:inline>
+                    </w:drawing>
+                  </w:r>
                 </w:p>
-                <w:tbl>
-                  <w:tblPr>
-                    <w:tblW w:type="auto" w:w="0"/>
-                    <w:tblLayout w:type="fixed"/>
-                    <w:tblLook w:firstColumn="1" w:firstRow="1" w:lastColumn="0" w:lastRow="0" w:noHBand="0" w:noVBand="1" w:val="04A0"/>
-                  </w:tblPr>
-                  <w:tblGrid>
-                    <w:gridCol w:w="198"/>
-                    <w:gridCol w:w="198"/>
-                  </w:tblGrid>
-                  <w:tr>
-                    <w:trPr>
-                      <w:trHeight w:val="198" w:hRule="exact"/>
-                    </w:trPr>
-                    <w:tc>
-                      <w:tcPr>
-                        <w:tcW w:type="dxa" w:w="198"/>
-                        <w:tcBorders>
-                          <w:top w:val="single" w:sz="12" w:space="0" w:color="000000"/>
-                          <w:left w:val="single" w:sz="12" w:space="0" w:color="000000"/>
-                          <w:bottom w:val="dashed" w:sz="6" w:space="0" w:color="808080"/>
-                          <w:right w:val="dashed" w:sz="6" w:space="0" w:color="808080"/>
-                        </w:tcBorders>
-                      </w:tcPr>
-                      <w:p>
-                        <w:pPr>
-                          <w:spacing w:before="0" w:after="0"/>
-                        </w:pPr>
-                        <w:r/>
-                        <w:r>
-                          <w:rPr>
-                            <w:rFonts w:ascii="宋体" w:hAnsi="宋体" w:eastAsia="宋体"/>
-                            <w:b w:val="0"/>
-                            <w:color w:val="1C1917"/>
-                            <w:sz w:val="12"/>
-                          </w:rPr>
-                          <w:t xml:space="preserve"> </w:t>
-                        </w:r>
-                      </w:p>
-                    </w:tc>
-                    <w:tc>
-                      <w:tcPr>
-                        <w:tcW w:type="dxa" w:w="198"/>
-                        <w:tcBorders>
-                          <w:top w:val="single" w:sz="12" w:space="0" w:color="000000"/>
-                          <w:left w:val="dashed" w:sz="6" w:space="0" w:color="808080"/>
-                          <w:bottom w:val="dashed" w:sz="6" w:space="0" w:color="808080"/>
-                          <w:right w:val="single" w:sz="12" w:space="0" w:color="000000"/>
-                        </w:tcBorders>
-                      </w:tcPr>
-                      <w:p>
-                        <w:pPr>
-                          <w:spacing w:before="0" w:after="0"/>
-                        </w:pPr>
-                        <w:r/>
-                        <w:r>
-                          <w:rPr>
-                            <w:rFonts w:ascii="宋体" w:hAnsi="宋体" w:eastAsia="宋体"/>
-                            <w:b w:val="0"/>
-                            <w:color w:val="1C1917"/>
-                            <w:sz w:val="12"/>
-                          </w:rPr>
-                          <w:t xml:space="preserve"> </w:t>
-                        </w:r>
-                      </w:p>
-                    </w:tc>
-                  </w:tr>
-                  <w:tr>
-                    <w:trPr>
-                      <w:trHeight w:val="198" w:hRule="exact"/>
-                    </w:trPr>
-                    <w:tc>
-                      <w:tcPr>
-                        <w:tcW w:type="dxa" w:w="198"/>
-                        <w:tcBorders>
-                          <w:top w:val="dashed" w:sz="6" w:space="0" w:color="808080"/>
-                          <w:left w:val="single" w:sz="12" w:space="0" w:color="000000"/>
-                          <w:bottom w:val="single" w:sz="12" w:space="0" w:color="000000"/>
-                          <w:right w:val="dashed" w:sz="6" w:space="0" w:color="808080"/>
-                        </w:tcBorders>
-                      </w:tcPr>
-                      <w:p>
-                        <w:pPr>
-                          <w:spacing w:before="0" w:after="0"/>
-                        </w:pPr>
-                        <w:r/>
-                        <w:r>
-                          <w:rPr>
-                            <w:rFonts w:ascii="宋体" w:hAnsi="宋体" w:eastAsia="宋体"/>
-                            <w:b w:val="0"/>
-                            <w:color w:val="1C1917"/>
-                            <w:sz w:val="12"/>
-                          </w:rPr>
-                          <w:t xml:space="preserve"> </w:t>
-                        </w:r>
-                      </w:p>
-                    </w:tc>
-                    <w:tc>
-                      <w:tcPr>
-                        <w:tcW w:type="dxa" w:w="198"/>
-                        <w:tcBorders>
-                          <w:top w:val="dashed" w:sz="6" w:space="0" w:color="808080"/>
-                          <w:left w:val="dashed" w:sz="6" w:space="0" w:color="808080"/>
-                          <w:bottom w:val="single" w:sz="12" w:space="0" w:color="000000"/>
-                          <w:right w:val="single" w:sz="12" w:space="0" w:color="000000"/>
-                        </w:tcBorders>
-                      </w:tcPr>
-                      <w:p>
-                        <w:pPr>
-                          <w:spacing w:before="0" w:after="0"/>
-                        </w:pPr>
-                        <w:r/>
-                        <w:r>
-                          <w:rPr>
-                            <w:rFonts w:ascii="宋体" w:hAnsi="宋体" w:eastAsia="宋体"/>
-                            <w:b w:val="0"/>
-                            <w:color w:val="1C1917"/>
-                            <w:sz w:val="12"/>
-                          </w:rPr>
-                          <w:t xml:space="preserve"> </w:t>
-                        </w:r>
-                      </w:p>
-                    </w:tc>
-                  </w:tr>
-                </w:tbl>
-                <w:p/>
               </w:tc>
               <w:tc>
                 <w:tcPr>
-                  <w:tcW w:type="dxa" w:w="397"/>
+                  <w:tcW w:type="dxa" w:w="425"/>
                   <w:tcBorders/>
                 </w:tcPr>
                 <w:p>
                   <w:pPr>
-                    <w:spacing w:before="0" w:after="0"/>
+                    <w:spacing w:before="0" w:after="0" w:line="240" w:lineRule="auto"/>
+                    <w:jc w:val="center"/>
                   </w:pPr>
                   <w:r/>
+                  <w:r>
+                    <w:drawing>
+                      <wp:inline xmlns:a="http://schemas.openxmlformats.org/drawingml/2006/main" xmlns:pic="http://schemas.openxmlformats.org/drawingml/2006/picture">
+                        <wp:extent cx="251999" cy="251999"/>
+                        <wp:docPr id="6" name="Picture 6"/>
+                        <wp:cNvGraphicFramePr>
+                          <a:graphicFrameLocks noChangeAspect="1"/>
+                        </wp:cNvGraphicFramePr>
+                        <a:graphic>
+                          <a:graphicData uri="http://schemas.openxmlformats.org/drawingml/2006/picture">
+                            <pic:pic>
+                              <pic:nvPicPr>
+                                <pic:cNvPr id="0" name="tianzige-140.png"/>
+                                <pic:cNvPicPr/>
+                              </pic:nvPicPr>
+                              <pic:blipFill>
+                                <a:blip r:embed="rId9"/>
+                                <a:stretch>
+                                  <a:fillRect/>
+                                </a:stretch>
+                              </pic:blipFill>
+                              <pic:spPr>
+                                <a:xfrm>
+                                  <a:off x="0" y="0"/>
+                                  <a:ext cx="251999" cy="251999"/>
+                                </a:xfrm>
+                                <a:prstGeom prst="rect"/>
+                              </pic:spPr>
+                            </pic:pic>
+                          </a:graphicData>
+                        </a:graphic>
+                      </wp:inline>
+                    </w:drawing>
+                  </w:r>
                 </w:p>
-                <w:tbl>
-                  <w:tblPr>
-                    <w:tblW w:type="auto" w:w="0"/>
-                    <w:tblLayout w:type="fixed"/>
-                    <w:tblLook w:firstColumn="1" w:firstRow="1" w:lastColumn="0" w:lastRow="0" w:noHBand="0" w:noVBand="1" w:val="04A0"/>
-                  </w:tblPr>
-                  <w:tblGrid>
-                    <w:gridCol w:w="198"/>
-                    <w:gridCol w:w="198"/>
-                  </w:tblGrid>
-                  <w:tr>
-                    <w:trPr>
-                      <w:trHeight w:val="198" w:hRule="exact"/>
-                    </w:trPr>
-                    <w:tc>
-                      <w:tcPr>
-                        <w:tcW w:type="dxa" w:w="198"/>
-                        <w:tcBorders>
-                          <w:top w:val="single" w:sz="12" w:space="0" w:color="000000"/>
-                          <w:left w:val="single" w:sz="12" w:space="0" w:color="000000"/>
-                          <w:bottom w:val="dashed" w:sz="6" w:space="0" w:color="808080"/>
-                          <w:right w:val="dashed" w:sz="6" w:space="0" w:color="808080"/>
-                        </w:tcBorders>
-                      </w:tcPr>
-                      <w:p>
-                        <w:pPr>
-                          <w:spacing w:before="0" w:after="0"/>
-                        </w:pPr>
-                        <w:r/>
-                        <w:r>
-                          <w:rPr>
-                            <w:rFonts w:ascii="宋体" w:hAnsi="宋体" w:eastAsia="宋体"/>
-                            <w:b w:val="0"/>
-                            <w:color w:val="1C1917"/>
-                            <w:sz w:val="12"/>
-                          </w:rPr>
-                          <w:t xml:space="preserve"> </w:t>
-                        </w:r>
-                      </w:p>
-                    </w:tc>
-                    <w:tc>
-                      <w:tcPr>
-                        <w:tcW w:type="dxa" w:w="198"/>
-                        <w:tcBorders>
-                          <w:top w:val="single" w:sz="12" w:space="0" w:color="000000"/>
-                          <w:left w:val="dashed" w:sz="6" w:space="0" w:color="808080"/>
-                          <w:bottom w:val="dashed" w:sz="6" w:space="0" w:color="808080"/>
-                          <w:right w:val="single" w:sz="12" w:space="0" w:color="000000"/>
-                        </w:tcBorders>
-                      </w:tcPr>
-                      <w:p>
-                        <w:pPr>
-                          <w:spacing w:before="0" w:after="0"/>
-                        </w:pPr>
-                        <w:r/>
-                        <w:r>
-                          <w:rPr>
-                            <w:rFonts w:ascii="宋体" w:hAnsi="宋体" w:eastAsia="宋体"/>
-                            <w:b w:val="0"/>
-                            <w:color w:val="1C1917"/>
-                            <w:sz w:val="12"/>
-                          </w:rPr>
-                          <w:t xml:space="preserve"> </w:t>
-                        </w:r>
-                      </w:p>
-                    </w:tc>
-                  </w:tr>
-                  <w:tr>
-                    <w:trPr>
-                      <w:trHeight w:val="198" w:hRule="exact"/>
-                    </w:trPr>
-                    <w:tc>
-                      <w:tcPr>
-                        <w:tcW w:type="dxa" w:w="198"/>
-                        <w:tcBorders>
-                          <w:top w:val="dashed" w:sz="6" w:space="0" w:color="808080"/>
-                          <w:left w:val="single" w:sz="12" w:space="0" w:color="000000"/>
-                          <w:bottom w:val="single" w:sz="12" w:space="0" w:color="000000"/>
-                          <w:right w:val="dashed" w:sz="6" w:space="0" w:color="808080"/>
-                        </w:tcBorders>
-                      </w:tcPr>
-                      <w:p>
-                        <w:pPr>
-                          <w:spacing w:before="0" w:after="0"/>
-                        </w:pPr>
-                        <w:r/>
-                        <w:r>
-                          <w:rPr>
-                            <w:rFonts w:ascii="宋体" w:hAnsi="宋体" w:eastAsia="宋体"/>
-                            <w:b w:val="0"/>
-                            <w:color w:val="1C1917"/>
-                            <w:sz w:val="12"/>
-                          </w:rPr>
-                          <w:t xml:space="preserve"> </w:t>
-                        </w:r>
-                      </w:p>
-                    </w:tc>
-                    <w:tc>
-                      <w:tcPr>
-                        <w:tcW w:type="dxa" w:w="198"/>
-                        <w:tcBorders>
-                          <w:top w:val="dashed" w:sz="6" w:space="0" w:color="808080"/>
-                          <w:left w:val="dashed" w:sz="6" w:space="0" w:color="808080"/>
-                          <w:bottom w:val="single" w:sz="12" w:space="0" w:color="000000"/>
-                          <w:right w:val="single" w:sz="12" w:space="0" w:color="000000"/>
-                        </w:tcBorders>
-                      </w:tcPr>
-                      <w:p>
-                        <w:pPr>
-                          <w:spacing w:before="0" w:after="0"/>
-                        </w:pPr>
-                        <w:r/>
-                        <w:r>
-                          <w:rPr>
-                            <w:rFonts w:ascii="宋体" w:hAnsi="宋体" w:eastAsia="宋体"/>
-                            <w:b w:val="0"/>
-                            <w:color w:val="1C1917"/>
-                            <w:sz w:val="12"/>
-                          </w:rPr>
-                          <w:t xml:space="preserve"> </w:t>
-                        </w:r>
-                      </w:p>
-                    </w:tc>
-                  </w:tr>
-                </w:tbl>
-                <w:p/>
               </w:tc>
             </w:tr>
           </w:tbl>
@@ -1196,7 +677,7 @@
       </w:tblGrid>
       <w:tr>
         <w:trPr>
-          <w:trHeight w:val="612" w:hRule="atLeast"/>
+          <w:trHeight w:val="708" w:hRule="atLeast"/>
         </w:trPr>
         <w:tc>
           <w:tcPr>
@@ -1223,13 +704,13 @@
         </w:tc>
         <w:tc>
           <w:tcPr>
-            <w:tcW w:type="dxa" w:w="907"/>
+            <w:tcW w:type="dxa" w:w="1049"/>
             <w:vAlign w:val="center"/>
             <w:tcBorders/>
           </w:tcPr>
           <w:p>
             <w:pPr>
-              <w:spacing w:before="0" w:after="0"/>
+              <w:spacing w:before="0" w:after="20"/>
               <w:jc w:val="center"/>
             </w:pPr>
             <w:r/>
@@ -1246,292 +727,119 @@
           <w:tbl>
             <w:tblPr>
               <w:tblW w:type="auto" w:w="0"/>
+              <w:jc w:val="center"/>
               <w:tblLayout w:type="fixed"/>
               <w:tblLook w:firstColumn="1" w:firstRow="1" w:lastColumn="0" w:lastRow="0" w:noHBand="0" w:noVBand="1" w:val="04A0"/>
+              <w:tblBorders>
+                <w:top w:val="nil"/>
+                <w:left w:val="nil"/>
+                <w:bottom w:val="nil"/>
+                <w:right w:val="nil"/>
+                <w:insideH w:val="nil"/>
+                <w:insideV w:val="nil"/>
+              </w:tblBorders>
             </w:tblPr>
             <w:tblGrid>
-              <w:gridCol w:w="453"/>
-              <w:gridCol w:w="453"/>
+              <w:gridCol w:w="524"/>
+              <w:gridCol w:w="524"/>
             </w:tblGrid>
             <w:tr>
               <w:trPr>
-                <w:trHeight w:val="396" w:hRule="exact"/>
+                <w:trHeight w:val="442" w:hRule="atLeast"/>
               </w:trPr>
               <w:tc>
                 <w:tcPr>
-                  <w:tcW w:type="dxa" w:w="397"/>
+                  <w:tcW w:type="dxa" w:w="425"/>
                   <w:tcBorders/>
                 </w:tcPr>
                 <w:p>
                   <w:pPr>
-                    <w:spacing w:before="0" w:after="0"/>
+                    <w:spacing w:before="0" w:after="0" w:line="240" w:lineRule="auto"/>
+                    <w:jc w:val="center"/>
                   </w:pPr>
                   <w:r/>
+                  <w:r>
+                    <w:drawing>
+                      <wp:inline xmlns:a="http://schemas.openxmlformats.org/drawingml/2006/main" xmlns:pic="http://schemas.openxmlformats.org/drawingml/2006/picture">
+                        <wp:extent cx="251999" cy="251999"/>
+                        <wp:docPr id="7" name="Picture 7"/>
+                        <wp:cNvGraphicFramePr>
+                          <a:graphicFrameLocks noChangeAspect="1"/>
+                        </wp:cNvGraphicFramePr>
+                        <a:graphic>
+                          <a:graphicData uri="http://schemas.openxmlformats.org/drawingml/2006/picture">
+                            <pic:pic>
+                              <pic:nvPicPr>
+                                <pic:cNvPr id="0" name="tianzige-140.png"/>
+                                <pic:cNvPicPr/>
+                              </pic:nvPicPr>
+                              <pic:blipFill>
+                                <a:blip r:embed="rId9"/>
+                                <a:stretch>
+                                  <a:fillRect/>
+                                </a:stretch>
+                              </pic:blipFill>
+                              <pic:spPr>
+                                <a:xfrm>
+                                  <a:off x="0" y="0"/>
+                                  <a:ext cx="251999" cy="251999"/>
+                                </a:xfrm>
+                                <a:prstGeom prst="rect"/>
+                              </pic:spPr>
+                            </pic:pic>
+                          </a:graphicData>
+                        </a:graphic>
+                      </wp:inline>
+                    </w:drawing>
+                  </w:r>
                 </w:p>
-                <w:tbl>
-                  <w:tblPr>
-                    <w:tblW w:type="auto" w:w="0"/>
-                    <w:tblLayout w:type="fixed"/>
-                    <w:tblLook w:firstColumn="1" w:firstRow="1" w:lastColumn="0" w:lastRow="0" w:noHBand="0" w:noVBand="1" w:val="04A0"/>
-                  </w:tblPr>
-                  <w:tblGrid>
-                    <w:gridCol w:w="198"/>
-                    <w:gridCol w:w="198"/>
-                  </w:tblGrid>
-                  <w:tr>
-                    <w:trPr>
-                      <w:trHeight w:val="198" w:hRule="exact"/>
-                    </w:trPr>
-                    <w:tc>
-                      <w:tcPr>
-                        <w:tcW w:type="dxa" w:w="198"/>
-                        <w:tcBorders>
-                          <w:top w:val="single" w:sz="12" w:space="0" w:color="000000"/>
-                          <w:left w:val="single" w:sz="12" w:space="0" w:color="000000"/>
-                          <w:bottom w:val="dashed" w:sz="6" w:space="0" w:color="808080"/>
-                          <w:right w:val="dashed" w:sz="6" w:space="0" w:color="808080"/>
-                        </w:tcBorders>
-                      </w:tcPr>
-                      <w:p>
-                        <w:pPr>
-                          <w:spacing w:before="0" w:after="0"/>
-                        </w:pPr>
-                        <w:r/>
-                        <w:r>
-                          <w:rPr>
-                            <w:rFonts w:ascii="宋体" w:hAnsi="宋体" w:eastAsia="宋体"/>
-                            <w:b w:val="0"/>
-                            <w:color w:val="1C1917"/>
-                            <w:sz w:val="12"/>
-                          </w:rPr>
-                          <w:t xml:space="preserve"> </w:t>
-                        </w:r>
-                      </w:p>
-                    </w:tc>
-                    <w:tc>
-                      <w:tcPr>
-                        <w:tcW w:type="dxa" w:w="198"/>
-                        <w:tcBorders>
-                          <w:top w:val="single" w:sz="12" w:space="0" w:color="000000"/>
-                          <w:left w:val="dashed" w:sz="6" w:space="0" w:color="808080"/>
-                          <w:bottom w:val="dashed" w:sz="6" w:space="0" w:color="808080"/>
-                          <w:right w:val="single" w:sz="12" w:space="0" w:color="000000"/>
-                        </w:tcBorders>
-                      </w:tcPr>
-                      <w:p>
-                        <w:pPr>
-                          <w:spacing w:before="0" w:after="0"/>
-                        </w:pPr>
-                        <w:r/>
-                        <w:r>
-                          <w:rPr>
-                            <w:rFonts w:ascii="宋体" w:hAnsi="宋体" w:eastAsia="宋体"/>
-                            <w:b w:val="0"/>
-                            <w:color w:val="1C1917"/>
-                            <w:sz w:val="12"/>
-                          </w:rPr>
-                          <w:t xml:space="preserve"> </w:t>
-                        </w:r>
-                      </w:p>
-                    </w:tc>
-                  </w:tr>
-                  <w:tr>
-                    <w:trPr>
-                      <w:trHeight w:val="198" w:hRule="exact"/>
-                    </w:trPr>
-                    <w:tc>
-                      <w:tcPr>
-                        <w:tcW w:type="dxa" w:w="198"/>
-                        <w:tcBorders>
-                          <w:top w:val="dashed" w:sz="6" w:space="0" w:color="808080"/>
-                          <w:left w:val="single" w:sz="12" w:space="0" w:color="000000"/>
-                          <w:bottom w:val="single" w:sz="12" w:space="0" w:color="000000"/>
-                          <w:right w:val="dashed" w:sz="6" w:space="0" w:color="808080"/>
-                        </w:tcBorders>
-                      </w:tcPr>
-                      <w:p>
-                        <w:pPr>
-                          <w:spacing w:before="0" w:after="0"/>
-                        </w:pPr>
-                        <w:r/>
-                        <w:r>
-                          <w:rPr>
-                            <w:rFonts w:ascii="宋体" w:hAnsi="宋体" w:eastAsia="宋体"/>
-                            <w:b w:val="0"/>
-                            <w:color w:val="1C1917"/>
-                            <w:sz w:val="12"/>
-                          </w:rPr>
-                          <w:t xml:space="preserve"> </w:t>
-                        </w:r>
-                      </w:p>
-                    </w:tc>
-                    <w:tc>
-                      <w:tcPr>
-                        <w:tcW w:type="dxa" w:w="198"/>
-                        <w:tcBorders>
-                          <w:top w:val="dashed" w:sz="6" w:space="0" w:color="808080"/>
-                          <w:left w:val="dashed" w:sz="6" w:space="0" w:color="808080"/>
-                          <w:bottom w:val="single" w:sz="12" w:space="0" w:color="000000"/>
-                          <w:right w:val="single" w:sz="12" w:space="0" w:color="000000"/>
-                        </w:tcBorders>
-                      </w:tcPr>
-                      <w:p>
-                        <w:pPr>
-                          <w:spacing w:before="0" w:after="0"/>
-                        </w:pPr>
-                        <w:r/>
-                        <w:r>
-                          <w:rPr>
-                            <w:rFonts w:ascii="宋体" w:hAnsi="宋体" w:eastAsia="宋体"/>
-                            <w:b w:val="0"/>
-                            <w:color w:val="1C1917"/>
-                            <w:sz w:val="12"/>
-                          </w:rPr>
-                          <w:t xml:space="preserve"> </w:t>
-                        </w:r>
-                      </w:p>
-                    </w:tc>
-                  </w:tr>
-                </w:tbl>
-                <w:p/>
               </w:tc>
               <w:tc>
                 <w:tcPr>
-                  <w:tcW w:type="dxa" w:w="397"/>
+                  <w:tcW w:type="dxa" w:w="425"/>
                   <w:tcBorders/>
                 </w:tcPr>
                 <w:p>
                   <w:pPr>
-                    <w:spacing w:before="0" w:after="0"/>
+                    <w:spacing w:before="0" w:after="0" w:line="240" w:lineRule="auto"/>
+                    <w:jc w:val="center"/>
                   </w:pPr>
                   <w:r/>
+                  <w:r>
+                    <w:drawing>
+                      <wp:inline xmlns:a="http://schemas.openxmlformats.org/drawingml/2006/main" xmlns:pic="http://schemas.openxmlformats.org/drawingml/2006/picture">
+                        <wp:extent cx="251999" cy="251999"/>
+                        <wp:docPr id="8" name="Picture 8"/>
+                        <wp:cNvGraphicFramePr>
+                          <a:graphicFrameLocks noChangeAspect="1"/>
+                        </wp:cNvGraphicFramePr>
+                        <a:graphic>
+                          <a:graphicData uri="http://schemas.openxmlformats.org/drawingml/2006/picture">
+                            <pic:pic>
+                              <pic:nvPicPr>
+                                <pic:cNvPr id="0" name="tianzige-140.png"/>
+                                <pic:cNvPicPr/>
+                              </pic:nvPicPr>
+                              <pic:blipFill>
+                                <a:blip r:embed="rId9"/>
+                                <a:stretch>
+                                  <a:fillRect/>
+                                </a:stretch>
+                              </pic:blipFill>
+                              <pic:spPr>
+                                <a:xfrm>
+                                  <a:off x="0" y="0"/>
+                                  <a:ext cx="251999" cy="251999"/>
+                                </a:xfrm>
+                                <a:prstGeom prst="rect"/>
+                              </pic:spPr>
+                            </pic:pic>
+                          </a:graphicData>
+                        </a:graphic>
+                      </wp:inline>
+                    </w:drawing>
+                  </w:r>
                 </w:p>
-                <w:tbl>
-                  <w:tblPr>
-                    <w:tblW w:type="auto" w:w="0"/>
-                    <w:tblLayout w:type="fixed"/>
-                    <w:tblLook w:firstColumn="1" w:firstRow="1" w:lastColumn="0" w:lastRow="0" w:noHBand="0" w:noVBand="1" w:val="04A0"/>
-                  </w:tblPr>
-                  <w:tblGrid>
-                    <w:gridCol w:w="198"/>
-                    <w:gridCol w:w="198"/>
-                  </w:tblGrid>
-                  <w:tr>
-                    <w:trPr>
-                      <w:trHeight w:val="198" w:hRule="exact"/>
-                    </w:trPr>
-                    <w:tc>
-                      <w:tcPr>
-                        <w:tcW w:type="dxa" w:w="198"/>
-                        <w:tcBorders>
-                          <w:top w:val="single" w:sz="12" w:space="0" w:color="000000"/>
-                          <w:left w:val="single" w:sz="12" w:space="0" w:color="000000"/>
-                          <w:bottom w:val="dashed" w:sz="6" w:space="0" w:color="808080"/>
-                          <w:right w:val="dashed" w:sz="6" w:space="0" w:color="808080"/>
-                        </w:tcBorders>
-                      </w:tcPr>
-                      <w:p>
-                        <w:pPr>
-                          <w:spacing w:before="0" w:after="0"/>
-                        </w:pPr>
-                        <w:r/>
-                        <w:r>
-                          <w:rPr>
-                            <w:rFonts w:ascii="宋体" w:hAnsi="宋体" w:eastAsia="宋体"/>
-                            <w:b w:val="0"/>
-                            <w:color w:val="1C1917"/>
-                            <w:sz w:val="12"/>
-                          </w:rPr>
-                          <w:t xml:space="preserve"> </w:t>
-                        </w:r>
-                      </w:p>
-                    </w:tc>
-                    <w:tc>
-                      <w:tcPr>
-                        <w:tcW w:type="dxa" w:w="198"/>
-                        <w:tcBorders>
-                          <w:top w:val="single" w:sz="12" w:space="0" w:color="000000"/>
-                          <w:left w:val="dashed" w:sz="6" w:space="0" w:color="808080"/>
-                          <w:bottom w:val="dashed" w:sz="6" w:space="0" w:color="808080"/>
-                          <w:right w:val="single" w:sz="12" w:space="0" w:color="000000"/>
-                        </w:tcBorders>
-                      </w:tcPr>
-                      <w:p>
-                        <w:pPr>
-                          <w:spacing w:before="0" w:after="0"/>
-                        </w:pPr>
-                        <w:r/>
-                        <w:r>
-                          <w:rPr>
-                            <w:rFonts w:ascii="宋体" w:hAnsi="宋体" w:eastAsia="宋体"/>
-                            <w:b w:val="0"/>
-                            <w:color w:val="1C1917"/>
-                            <w:sz w:val="12"/>
-                          </w:rPr>
-                          <w:t xml:space="preserve"> </w:t>
-                        </w:r>
-                      </w:p>
-                    </w:tc>
-                  </w:tr>
-                  <w:tr>
-                    <w:trPr>
-                      <w:trHeight w:val="198" w:hRule="exact"/>
-                    </w:trPr>
-                    <w:tc>
-                      <w:tcPr>
-                        <w:tcW w:type="dxa" w:w="198"/>
-                        <w:tcBorders>
-                          <w:top w:val="dashed" w:sz="6" w:space="0" w:color="808080"/>
-                          <w:left w:val="single" w:sz="12" w:space="0" w:color="000000"/>
-                          <w:bottom w:val="single" w:sz="12" w:space="0" w:color="000000"/>
-                          <w:right w:val="dashed" w:sz="6" w:space="0" w:color="808080"/>
-                        </w:tcBorders>
-                      </w:tcPr>
-                      <w:p>
-                        <w:pPr>
-                          <w:spacing w:before="0" w:after="0"/>
-                        </w:pPr>
-                        <w:r/>
-                        <w:r>
-                          <w:rPr>
-                            <w:rFonts w:ascii="宋体" w:hAnsi="宋体" w:eastAsia="宋体"/>
-                            <w:b w:val="0"/>
-                            <w:color w:val="1C1917"/>
-                            <w:sz w:val="12"/>
-                          </w:rPr>
-                          <w:t xml:space="preserve"> </w:t>
-                        </w:r>
-                      </w:p>
-                    </w:tc>
-                    <w:tc>
-                      <w:tcPr>
-                        <w:tcW w:type="dxa" w:w="198"/>
-                        <w:tcBorders>
-                          <w:top w:val="dashed" w:sz="6" w:space="0" w:color="808080"/>
-                          <w:left w:val="dashed" w:sz="6" w:space="0" w:color="808080"/>
-                          <w:bottom w:val="single" w:sz="12" w:space="0" w:color="000000"/>
-                          <w:right w:val="single" w:sz="12" w:space="0" w:color="000000"/>
-                        </w:tcBorders>
-                      </w:tcPr>
-                      <w:p>
-                        <w:pPr>
-                          <w:spacing w:before="0" w:after="0"/>
-                        </w:pPr>
-                        <w:r/>
-                        <w:r>
-                          <w:rPr>
-                            <w:rFonts w:ascii="宋体" w:hAnsi="宋体" w:eastAsia="宋体"/>
-                            <w:b w:val="0"/>
-                            <w:color w:val="1C1917"/>
-                            <w:sz w:val="12"/>
-                          </w:rPr>
-                          <w:t xml:space="preserve"> </w:t>
-                        </w:r>
-                      </w:p>
-                    </w:tc>
-                  </w:tr>
-                </w:tbl>
-                <w:p/>
               </w:tc>
             </w:tr>
           </w:tbl>
@@ -1562,13 +870,13 @@
         </w:tc>
         <w:tc>
           <w:tcPr>
-            <w:tcW w:type="dxa" w:w="907"/>
+            <w:tcW w:type="dxa" w:w="1049"/>
             <w:vAlign w:val="center"/>
             <w:tcBorders/>
           </w:tcPr>
           <w:p>
             <w:pPr>
-              <w:spacing w:before="0" w:after="0"/>
+              <w:spacing w:before="0" w:after="20"/>
               <w:jc w:val="center"/>
             </w:pPr>
             <w:r/>
@@ -1585,292 +893,119 @@
           <w:tbl>
             <w:tblPr>
               <w:tblW w:type="auto" w:w="0"/>
+              <w:jc w:val="center"/>
               <w:tblLayout w:type="fixed"/>
               <w:tblLook w:firstColumn="1" w:firstRow="1" w:lastColumn="0" w:lastRow="0" w:noHBand="0" w:noVBand="1" w:val="04A0"/>
+              <w:tblBorders>
+                <w:top w:val="nil"/>
+                <w:left w:val="nil"/>
+                <w:bottom w:val="nil"/>
+                <w:right w:val="nil"/>
+                <w:insideH w:val="nil"/>
+                <w:insideV w:val="nil"/>
+              </w:tblBorders>
             </w:tblPr>
             <w:tblGrid>
-              <w:gridCol w:w="453"/>
-              <w:gridCol w:w="453"/>
+              <w:gridCol w:w="524"/>
+              <w:gridCol w:w="524"/>
             </w:tblGrid>
             <w:tr>
               <w:trPr>
-                <w:trHeight w:val="396" w:hRule="exact"/>
+                <w:trHeight w:val="442" w:hRule="atLeast"/>
               </w:trPr>
               <w:tc>
                 <w:tcPr>
-                  <w:tcW w:type="dxa" w:w="397"/>
+                  <w:tcW w:type="dxa" w:w="425"/>
                   <w:tcBorders/>
                 </w:tcPr>
                 <w:p>
                   <w:pPr>
-                    <w:spacing w:before="0" w:after="0"/>
+                    <w:spacing w:before="0" w:after="0" w:line="240" w:lineRule="auto"/>
+                    <w:jc w:val="center"/>
                   </w:pPr>
                   <w:r/>
+                  <w:r>
+                    <w:drawing>
+                      <wp:inline xmlns:a="http://schemas.openxmlformats.org/drawingml/2006/main" xmlns:pic="http://schemas.openxmlformats.org/drawingml/2006/picture">
+                        <wp:extent cx="251999" cy="251999"/>
+                        <wp:docPr id="9" name="Picture 9"/>
+                        <wp:cNvGraphicFramePr>
+                          <a:graphicFrameLocks noChangeAspect="1"/>
+                        </wp:cNvGraphicFramePr>
+                        <a:graphic>
+                          <a:graphicData uri="http://schemas.openxmlformats.org/drawingml/2006/picture">
+                            <pic:pic>
+                              <pic:nvPicPr>
+                                <pic:cNvPr id="0" name="tianzige-140.png"/>
+                                <pic:cNvPicPr/>
+                              </pic:nvPicPr>
+                              <pic:blipFill>
+                                <a:blip r:embed="rId9"/>
+                                <a:stretch>
+                                  <a:fillRect/>
+                                </a:stretch>
+                              </pic:blipFill>
+                              <pic:spPr>
+                                <a:xfrm>
+                                  <a:off x="0" y="0"/>
+                                  <a:ext cx="251999" cy="251999"/>
+                                </a:xfrm>
+                                <a:prstGeom prst="rect"/>
+                              </pic:spPr>
+                            </pic:pic>
+                          </a:graphicData>
+                        </a:graphic>
+                      </wp:inline>
+                    </w:drawing>
+                  </w:r>
                 </w:p>
-                <w:tbl>
-                  <w:tblPr>
-                    <w:tblW w:type="auto" w:w="0"/>
-                    <w:tblLayout w:type="fixed"/>
-                    <w:tblLook w:firstColumn="1" w:firstRow="1" w:lastColumn="0" w:lastRow="0" w:noHBand="0" w:noVBand="1" w:val="04A0"/>
-                  </w:tblPr>
-                  <w:tblGrid>
-                    <w:gridCol w:w="198"/>
-                    <w:gridCol w:w="198"/>
-                  </w:tblGrid>
-                  <w:tr>
-                    <w:trPr>
-                      <w:trHeight w:val="198" w:hRule="exact"/>
-                    </w:trPr>
-                    <w:tc>
-                      <w:tcPr>
-                        <w:tcW w:type="dxa" w:w="198"/>
-                        <w:tcBorders>
-                          <w:top w:val="single" w:sz="12" w:space="0" w:color="000000"/>
-                          <w:left w:val="single" w:sz="12" w:space="0" w:color="000000"/>
-                          <w:bottom w:val="dashed" w:sz="6" w:space="0" w:color="808080"/>
-                          <w:right w:val="dashed" w:sz="6" w:space="0" w:color="808080"/>
-                        </w:tcBorders>
-                      </w:tcPr>
-                      <w:p>
-                        <w:pPr>
-                          <w:spacing w:before="0" w:after="0"/>
-                        </w:pPr>
-                        <w:r/>
-                        <w:r>
-                          <w:rPr>
-                            <w:rFonts w:ascii="宋体" w:hAnsi="宋体" w:eastAsia="宋体"/>
-                            <w:b w:val="0"/>
-                            <w:color w:val="1C1917"/>
-                            <w:sz w:val="12"/>
-                          </w:rPr>
-                          <w:t xml:space="preserve"> </w:t>
-                        </w:r>
-                      </w:p>
-                    </w:tc>
-                    <w:tc>
-                      <w:tcPr>
-                        <w:tcW w:type="dxa" w:w="198"/>
-                        <w:tcBorders>
-                          <w:top w:val="single" w:sz="12" w:space="0" w:color="000000"/>
-                          <w:left w:val="dashed" w:sz="6" w:space="0" w:color="808080"/>
-                          <w:bottom w:val="dashed" w:sz="6" w:space="0" w:color="808080"/>
-                          <w:right w:val="single" w:sz="12" w:space="0" w:color="000000"/>
-                        </w:tcBorders>
-                      </w:tcPr>
-                      <w:p>
-                        <w:pPr>
-                          <w:spacing w:before="0" w:after="0"/>
-                        </w:pPr>
-                        <w:r/>
-                        <w:r>
-                          <w:rPr>
-                            <w:rFonts w:ascii="宋体" w:hAnsi="宋体" w:eastAsia="宋体"/>
-                            <w:b w:val="0"/>
-                            <w:color w:val="1C1917"/>
-                            <w:sz w:val="12"/>
-                          </w:rPr>
-                          <w:t xml:space="preserve"> </w:t>
-                        </w:r>
-                      </w:p>
-                    </w:tc>
-                  </w:tr>
-                  <w:tr>
-                    <w:trPr>
-                      <w:trHeight w:val="198" w:hRule="exact"/>
-                    </w:trPr>
-                    <w:tc>
-                      <w:tcPr>
-                        <w:tcW w:type="dxa" w:w="198"/>
-                        <w:tcBorders>
-                          <w:top w:val="dashed" w:sz="6" w:space="0" w:color="808080"/>
-                          <w:left w:val="single" w:sz="12" w:space="0" w:color="000000"/>
-                          <w:bottom w:val="single" w:sz="12" w:space="0" w:color="000000"/>
-                          <w:right w:val="dashed" w:sz="6" w:space="0" w:color="808080"/>
-                        </w:tcBorders>
-                      </w:tcPr>
-                      <w:p>
-                        <w:pPr>
-                          <w:spacing w:before="0" w:after="0"/>
-                        </w:pPr>
-                        <w:r/>
-                        <w:r>
-                          <w:rPr>
-                            <w:rFonts w:ascii="宋体" w:hAnsi="宋体" w:eastAsia="宋体"/>
-                            <w:b w:val="0"/>
-                            <w:color w:val="1C1917"/>
-                            <w:sz w:val="12"/>
-                          </w:rPr>
-                          <w:t xml:space="preserve"> </w:t>
-                        </w:r>
-                      </w:p>
-                    </w:tc>
-                    <w:tc>
-                      <w:tcPr>
-                        <w:tcW w:type="dxa" w:w="198"/>
-                        <w:tcBorders>
-                          <w:top w:val="dashed" w:sz="6" w:space="0" w:color="808080"/>
-                          <w:left w:val="dashed" w:sz="6" w:space="0" w:color="808080"/>
-                          <w:bottom w:val="single" w:sz="12" w:space="0" w:color="000000"/>
-                          <w:right w:val="single" w:sz="12" w:space="0" w:color="000000"/>
-                        </w:tcBorders>
-                      </w:tcPr>
-                      <w:p>
-                        <w:pPr>
-                          <w:spacing w:before="0" w:after="0"/>
-                        </w:pPr>
-                        <w:r/>
-                        <w:r>
-                          <w:rPr>
-                            <w:rFonts w:ascii="宋体" w:hAnsi="宋体" w:eastAsia="宋体"/>
-                            <w:b w:val="0"/>
-                            <w:color w:val="1C1917"/>
-                            <w:sz w:val="12"/>
-                          </w:rPr>
-                          <w:t xml:space="preserve"> </w:t>
-                        </w:r>
-                      </w:p>
-                    </w:tc>
-                  </w:tr>
-                </w:tbl>
-                <w:p/>
               </w:tc>
               <w:tc>
                 <w:tcPr>
-                  <w:tcW w:type="dxa" w:w="397"/>
+                  <w:tcW w:type="dxa" w:w="425"/>
                   <w:tcBorders/>
                 </w:tcPr>
                 <w:p>
                   <w:pPr>
-                    <w:spacing w:before="0" w:after="0"/>
+                    <w:spacing w:before="0" w:after="0" w:line="240" w:lineRule="auto"/>
+                    <w:jc w:val="center"/>
                   </w:pPr>
                   <w:r/>
+                  <w:r>
+                    <w:drawing>
+                      <wp:inline xmlns:a="http://schemas.openxmlformats.org/drawingml/2006/main" xmlns:pic="http://schemas.openxmlformats.org/drawingml/2006/picture">
+                        <wp:extent cx="251999" cy="251999"/>
+                        <wp:docPr id="10" name="Picture 10"/>
+                        <wp:cNvGraphicFramePr>
+                          <a:graphicFrameLocks noChangeAspect="1"/>
+                        </wp:cNvGraphicFramePr>
+                        <a:graphic>
+                          <a:graphicData uri="http://schemas.openxmlformats.org/drawingml/2006/picture">
+                            <pic:pic>
+                              <pic:nvPicPr>
+                                <pic:cNvPr id="0" name="tianzige-140.png"/>
+                                <pic:cNvPicPr/>
+                              </pic:nvPicPr>
+                              <pic:blipFill>
+                                <a:blip r:embed="rId9"/>
+                                <a:stretch>
+                                  <a:fillRect/>
+                                </a:stretch>
+                              </pic:blipFill>
+                              <pic:spPr>
+                                <a:xfrm>
+                                  <a:off x="0" y="0"/>
+                                  <a:ext cx="251999" cy="251999"/>
+                                </a:xfrm>
+                                <a:prstGeom prst="rect"/>
+                              </pic:spPr>
+                            </pic:pic>
+                          </a:graphicData>
+                        </a:graphic>
+                      </wp:inline>
+                    </w:drawing>
+                  </w:r>
                 </w:p>
-                <w:tbl>
-                  <w:tblPr>
-                    <w:tblW w:type="auto" w:w="0"/>
-                    <w:tblLayout w:type="fixed"/>
-                    <w:tblLook w:firstColumn="1" w:firstRow="1" w:lastColumn="0" w:lastRow="0" w:noHBand="0" w:noVBand="1" w:val="04A0"/>
-                  </w:tblPr>
-                  <w:tblGrid>
-                    <w:gridCol w:w="198"/>
-                    <w:gridCol w:w="198"/>
-                  </w:tblGrid>
-                  <w:tr>
-                    <w:trPr>
-                      <w:trHeight w:val="198" w:hRule="exact"/>
-                    </w:trPr>
-                    <w:tc>
-                      <w:tcPr>
-                        <w:tcW w:type="dxa" w:w="198"/>
-                        <w:tcBorders>
-                          <w:top w:val="single" w:sz="12" w:space="0" w:color="000000"/>
-                          <w:left w:val="single" w:sz="12" w:space="0" w:color="000000"/>
-                          <w:bottom w:val="dashed" w:sz="6" w:space="0" w:color="808080"/>
-                          <w:right w:val="dashed" w:sz="6" w:space="0" w:color="808080"/>
-                        </w:tcBorders>
-                      </w:tcPr>
-                      <w:p>
-                        <w:pPr>
-                          <w:spacing w:before="0" w:after="0"/>
-                        </w:pPr>
-                        <w:r/>
-                        <w:r>
-                          <w:rPr>
-                            <w:rFonts w:ascii="宋体" w:hAnsi="宋体" w:eastAsia="宋体"/>
-                            <w:b w:val="0"/>
-                            <w:color w:val="1C1917"/>
-                            <w:sz w:val="12"/>
-                          </w:rPr>
-                          <w:t xml:space="preserve"> </w:t>
-                        </w:r>
-                      </w:p>
-                    </w:tc>
-                    <w:tc>
-                      <w:tcPr>
-                        <w:tcW w:type="dxa" w:w="198"/>
-                        <w:tcBorders>
-                          <w:top w:val="single" w:sz="12" w:space="0" w:color="000000"/>
-                          <w:left w:val="dashed" w:sz="6" w:space="0" w:color="808080"/>
-                          <w:bottom w:val="dashed" w:sz="6" w:space="0" w:color="808080"/>
-                          <w:right w:val="single" w:sz="12" w:space="0" w:color="000000"/>
-                        </w:tcBorders>
-                      </w:tcPr>
-                      <w:p>
-                        <w:pPr>
-                          <w:spacing w:before="0" w:after="0"/>
-                        </w:pPr>
-                        <w:r/>
-                        <w:r>
-                          <w:rPr>
-                            <w:rFonts w:ascii="宋体" w:hAnsi="宋体" w:eastAsia="宋体"/>
-                            <w:b w:val="0"/>
-                            <w:color w:val="1C1917"/>
-                            <w:sz w:val="12"/>
-                          </w:rPr>
-                          <w:t xml:space="preserve"> </w:t>
-                        </w:r>
-                      </w:p>
-                    </w:tc>
-                  </w:tr>
-                  <w:tr>
-                    <w:trPr>
-                      <w:trHeight w:val="198" w:hRule="exact"/>
-                    </w:trPr>
-                    <w:tc>
-                      <w:tcPr>
-                        <w:tcW w:type="dxa" w:w="198"/>
-                        <w:tcBorders>
-                          <w:top w:val="dashed" w:sz="6" w:space="0" w:color="808080"/>
-                          <w:left w:val="single" w:sz="12" w:space="0" w:color="000000"/>
-                          <w:bottom w:val="single" w:sz="12" w:space="0" w:color="000000"/>
-                          <w:right w:val="dashed" w:sz="6" w:space="0" w:color="808080"/>
-                        </w:tcBorders>
-                      </w:tcPr>
-                      <w:p>
-                        <w:pPr>
-                          <w:spacing w:before="0" w:after="0"/>
-                        </w:pPr>
-                        <w:r/>
-                        <w:r>
-                          <w:rPr>
-                            <w:rFonts w:ascii="宋体" w:hAnsi="宋体" w:eastAsia="宋体"/>
-                            <w:b w:val="0"/>
-                            <w:color w:val="1C1917"/>
-                            <w:sz w:val="12"/>
-                          </w:rPr>
-                          <w:t xml:space="preserve"> </w:t>
-                        </w:r>
-                      </w:p>
-                    </w:tc>
-                    <w:tc>
-                      <w:tcPr>
-                        <w:tcW w:type="dxa" w:w="198"/>
-                        <w:tcBorders>
-                          <w:top w:val="dashed" w:sz="6" w:space="0" w:color="808080"/>
-                          <w:left w:val="dashed" w:sz="6" w:space="0" w:color="808080"/>
-                          <w:bottom w:val="single" w:sz="12" w:space="0" w:color="000000"/>
-                          <w:right w:val="single" w:sz="12" w:space="0" w:color="000000"/>
-                        </w:tcBorders>
-                      </w:tcPr>
-                      <w:p>
-                        <w:pPr>
-                          <w:spacing w:before="0" w:after="0"/>
-                        </w:pPr>
-                        <w:r/>
-                        <w:r>
-                          <w:rPr>
-                            <w:rFonts w:ascii="宋体" w:hAnsi="宋体" w:eastAsia="宋体"/>
-                            <w:b w:val="0"/>
-                            <w:color w:val="1C1917"/>
-                            <w:sz w:val="12"/>
-                          </w:rPr>
-                          <w:t xml:space="preserve"> </w:t>
-                        </w:r>
-                      </w:p>
-                    </w:tc>
-                  </w:tr>
-                </w:tbl>
-                <w:p/>
               </w:tc>
             </w:tr>
           </w:tbl>

</xml_diff>